<commit_message>
vrai rapport de stage
</commit_message>
<xml_diff>
--- a/Rapport de Stage/Rapport de Stage 2026.docx
+++ b/Rapport de Stage/Rapport de Stage 2026.docx
@@ -1,6 +1,6 @@
 
 <file path=word/document.xml><?xml version="1.0" encoding="utf-8"?>
-<w:document xmlns:wpc="http://schemas.microsoft.com/office/word/2010/wordprocessingCanvas" xmlns:cx="http://schemas.microsoft.com/office/drawing/2014/chartex" xmlns:cx1="http://schemas.microsoft.com/office/drawing/2015/9/8/chartex" xmlns:cx2="http://schemas.microsoft.com/office/drawing/2015/10/21/chartex" xmlns:cx3="http://schemas.microsoft.com/office/drawing/2016/5/9/chartex" xmlns:cx4="http://schemas.microsoft.com/office/drawing/2016/5/10/chartex" xmlns:cx5="http://schemas.microsoft.com/office/drawing/2016/5/11/chartex" xmlns:cx6="http://schemas.microsoft.com/office/drawing/2016/5/12/chartex" xmlns:cx7="http://schemas.microsoft.com/office/drawing/2016/5/13/chartex" xmlns:cx8="http://schemas.microsoft.com/office/drawing/2016/5/14/chartex" xmlns:mc="http://schemas.openxmlformats.org/markup-compatibility/2006" xmlns:aink="http://schemas.microsoft.com/office/drawing/2016/ink" xmlns:am3d="http://schemas.microsoft.com/office/drawing/2017/model3d" xmlns:o="urn:schemas-microsoft-com:office:office" xmlns:oel="http://schemas.microsoft.com/office/2019/extlst" xmlns:r="http://schemas.openxmlformats.org/officeDocument/2006/relationships" xmlns:m="http://schemas.openxmlformats.org/officeDocument/2006/math" xmlns:v="urn:schemas-microsoft-com:vml" xmlns:wp14="http://schemas.microsoft.com/office/word/2010/wordprocessingDrawing" xmlns:wp="http://schemas.openxmlformats.org/drawingml/2006/wordprocessingDrawing" xmlns:w10="urn:schemas-microsoft-com:office:word" xmlns:w="http://schemas.openxmlformats.org/wordprocessingml/2006/main" xmlns:w14="http://schemas.microsoft.com/office/word/2010/wordml" xmlns:w15="http://schemas.microsoft.com/office/word/2012/wordml" xmlns:w16cex="http://schemas.microsoft.com/office/word/2018/wordml/cex" xmlns:w16cid="http://schemas.microsoft.com/office/word/2016/wordml/cid" xmlns:w16="http://schemas.microsoft.com/office/word/2018/wordml" xmlns:w16du="http://schemas.microsoft.com/office/word/2023/wordml/word16du" xmlns:w16sdtdh="http://schemas.microsoft.com/office/word/2020/wordml/sdtdatahash" xmlns:w16se="http://schemas.microsoft.com/office/word/2015/wordml/symex" xmlns:wpg="http://schemas.microsoft.com/office/word/2010/wordprocessingGroup" xmlns:wpi="http://schemas.microsoft.com/office/word/2010/wordprocessingInk" xmlns:wne="http://schemas.microsoft.com/office/word/2006/wordml" xmlns:wps="http://schemas.microsoft.com/office/word/2010/wordprocessingShape" mc:Ignorable="w14 w15 w16se w16cid w16 w16cex w16sdtdh w16du wp14">
+<w:document xmlns:wpc="http://schemas.microsoft.com/office/word/2010/wordprocessingCanvas" xmlns:cx="http://schemas.microsoft.com/office/drawing/2014/chartex" xmlns:cx1="http://schemas.microsoft.com/office/drawing/2015/9/8/chartex" xmlns:cx2="http://schemas.microsoft.com/office/drawing/2015/10/21/chartex" xmlns:cx3="http://schemas.microsoft.com/office/drawing/2016/5/9/chartex" xmlns:cx4="http://schemas.microsoft.com/office/drawing/2016/5/10/chartex" xmlns:cx5="http://schemas.microsoft.com/office/drawing/2016/5/11/chartex" xmlns:cx6="http://schemas.microsoft.com/office/drawing/2016/5/12/chartex" xmlns:cx7="http://schemas.microsoft.com/office/drawing/2016/5/13/chartex" xmlns:cx8="http://schemas.microsoft.com/office/drawing/2016/5/14/chartex" xmlns:mc="http://schemas.openxmlformats.org/markup-compatibility/2006" xmlns:aink="http://schemas.microsoft.com/office/drawing/2016/ink" xmlns:am3d="http://schemas.microsoft.com/office/drawing/2017/model3d" xmlns:o="urn:schemas-microsoft-com:office:office" xmlns:oel="http://schemas.microsoft.com/office/2019/extlst" xmlns:r="http://schemas.openxmlformats.org/officeDocument/2006/relationships" xmlns:m="http://schemas.openxmlformats.org/officeDocument/2006/math" xmlns:v="urn:schemas-microsoft-com:vml" xmlns:wp14="http://schemas.microsoft.com/office/word/2010/wordprocessingDrawing" xmlns:wp="http://schemas.openxmlformats.org/drawingml/2006/wordprocessingDrawing" xmlns:w10="urn:schemas-microsoft-com:office:word" xmlns:w="http://schemas.openxmlformats.org/wordprocessingml/2006/main" xmlns:w14="http://schemas.microsoft.com/office/word/2010/wordml" xmlns:w15="http://schemas.microsoft.com/office/word/2012/wordml" xmlns:w16cex="http://schemas.microsoft.com/office/word/2018/wordml/cex" xmlns:w16cid="http://schemas.microsoft.com/office/word/2016/wordml/cid" xmlns:w16="http://schemas.microsoft.com/office/word/2018/wordml" xmlns:w16du="http://schemas.microsoft.com/office/word/2023/wordml/word16du" xmlns:w16sdtdh="http://schemas.microsoft.com/office/word/2020/wordml/sdtdatahash" xmlns:w16sdtfl="http://schemas.microsoft.com/office/word/2024/wordml/sdtformatlock" xmlns:w16se="http://schemas.microsoft.com/office/word/2015/wordml/symex" xmlns:wpg="http://schemas.microsoft.com/office/word/2010/wordprocessingGroup" xmlns:wpi="http://schemas.microsoft.com/office/word/2010/wordprocessingInk" xmlns:wne="http://schemas.microsoft.com/office/word/2006/wordml" xmlns:wps="http://schemas.microsoft.com/office/word/2010/wordprocessingShape" mc:Ignorable="w14 w15 w16se w16cid w16 w16cex w16sdtdh w16sdtfl w16du wp14">
   <w:body>
     <w:p>
       <w:pPr>
@@ -218,6 +218,12 @@
           </wp:anchor>
         </w:drawing>
       </w:r>
+      <w:r>
+        <w:rPr>
+          <w:sz w:val="20"/>
+        </w:rPr>
+        <w:t xml:space="preserve"> </w:t>
+      </w:r>
     </w:p>
     <w:p>
       <w:pPr>
@@ -303,11 +309,9 @@
         </w:rPr>
         <w:t xml:space="preserve"> </w:t>
       </w:r>
-      <w:proofErr w:type="spellStart"/>
       <w:r>
         <w:t>Logic@l</w:t>
       </w:r>
-      <w:proofErr w:type="spellEnd"/>
       <w:r>
         <w:rPr>
           <w:spacing w:val="-4"/>
@@ -495,13 +499,8 @@
         </w:rPr>
         <w:t xml:space="preserve"> </w:t>
       </w:r>
-      <w:proofErr w:type="spellStart"/>
-      <w:r>
-        <w:t>Jean-Phillipe</w:t>
-      </w:r>
-      <w:proofErr w:type="spellEnd"/>
-      <w:r>
-        <w:t xml:space="preserve"> Fontaine</w:t>
+      <w:r>
+        <w:t>Jean-Phillipe Fontaine</w:t>
       </w:r>
       <w:r>
         <w:rPr>
@@ -654,14 +653,12 @@
         </w:rPr>
         <w:t xml:space="preserve"> </w:t>
       </w:r>
-      <w:proofErr w:type="spellStart"/>
       <w:r>
         <w:rPr>
           <w:sz w:val="28"/>
         </w:rPr>
         <w:t>Logic@l</w:t>
       </w:r>
-      <w:proofErr w:type="spellEnd"/>
       <w:r>
         <w:rPr>
           <w:spacing w:val="-3"/>
@@ -794,7 +791,7 @@
           </mc:Choice>
           <mc:Fallback>
             <w:pict>
-              <v:shape w14:anchorId="2B6F01FE" id="Graphic 13" o:spid="_x0000_s1026" style="position:absolute;margin-left:113.8pt;margin-top:11.7pt;width:369.95pt;height:.5pt;z-index:-15727104;visibility:visible;mso-wrap-style:square;mso-wrap-distance-left:0;mso-wrap-distance-top:0;mso-wrap-distance-right:0;mso-wrap-distance-bottom:0;mso-position-horizontal:absolute;mso-position-horizontal-relative:page;mso-position-vertical:absolute;mso-position-vertical-relative:text;v-text-anchor:top" coordsize="4698365,6350" o:gfxdata="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" path="m4697857,l,,,6096r4697857,l4697857,xe" fillcolor="#5b9bd4" stroked="f">
+              <v:shape w14:anchorId="15C3A466" id="Graphic 13" o:spid="_x0000_s1026" style="position:absolute;margin-left:113.8pt;margin-top:11.7pt;width:369.95pt;height:.5pt;z-index:-15727104;visibility:visible;mso-wrap-style:square;mso-wrap-distance-left:0;mso-wrap-distance-top:0;mso-wrap-distance-right:0;mso-wrap-distance-bottom:0;mso-position-horizontal:absolute;mso-position-horizontal-relative:page;mso-position-vertical:absolute;mso-position-vertical-relative:text;v-text-anchor:top" coordsize="4698365,6350" o:gfxdata="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" path="m4697857,l,,,6096r4697857,l4697857,xe" fillcolor="#5b9bd4" stroked="f">
                 <v:path arrowok="t"/>
                 <w10:wrap type="topAndBottom" anchorx="page"/>
               </v:shape>
@@ -826,21 +823,7 @@
         <w:rPr>
           <w:sz w:val="28"/>
         </w:rPr>
-        <w:t xml:space="preserve">J’adresse mes remerciements à l’entreprise </w:t>
-      </w:r>
-      <w:proofErr w:type="spellStart"/>
-      <w:r>
-        <w:rPr>
-          <w:sz w:val="28"/>
-        </w:rPr>
-        <w:t>Logic@l</w:t>
-      </w:r>
-      <w:proofErr w:type="spellEnd"/>
-      <w:r>
-        <w:rPr>
-          <w:sz w:val="28"/>
-        </w:rPr>
-        <w:t xml:space="preserve"> Conseils, notamment au PDG</w:t>
+        <w:t>J’adresse mes remerciements à l’entreprise Logic@l Conseils, notamment au PDG</w:t>
       </w:r>
       <w:r>
         <w:rPr>
@@ -901,19 +884,11 @@
         </w:rPr>
         <w:t xml:space="preserve"> </w:t>
       </w:r>
-      <w:proofErr w:type="spellStart"/>
       <w:r>
         <w:rPr>
           <w:sz w:val="28"/>
         </w:rPr>
-        <w:t>Logic@l</w:t>
-      </w:r>
-      <w:proofErr w:type="spellEnd"/>
-      <w:r>
-        <w:rPr>
-          <w:sz w:val="28"/>
-        </w:rPr>
-        <w:t xml:space="preserve"> pour</w:t>
+        <w:t>Logic@l pour</w:t>
       </w:r>
       <w:r>
         <w:rPr>
@@ -1014,7 +989,19 @@
         <w:rPr>
           <w:sz w:val="28"/>
         </w:rPr>
-        <w:t>, mais également à l’équipe de pôle Recherche et Développement avec qui j’ai travaillé et qui ont su me guider tout au long de la réalisation professionnelle.</w:t>
+        <w:t>, mais également à l’équipe de pôle</w:t>
+      </w:r>
+      <w:r>
+        <w:rPr>
+          <w:sz w:val="28"/>
+        </w:rPr>
+        <w:t xml:space="preserve"> </w:t>
+      </w:r>
+      <w:r>
+        <w:rPr>
+          <w:sz w:val="28"/>
+        </w:rPr>
+        <w:t>Recherche et Développement avec qui j’ai travaillé et qui ont su me guider tout au long de la réalisation professionnelle.</w:t>
       </w:r>
     </w:p>
     <w:p>
@@ -1070,16 +1057,8 @@
         <w:rPr>
           <w:color w:val="5B9BD4"/>
         </w:rPr>
-        <w:t xml:space="preserve">l’entreprise </w:t>
-      </w:r>
-      <w:proofErr w:type="spellStart"/>
-      <w:r>
-        <w:rPr>
-          <w:color w:val="5B9BD4"/>
-        </w:rPr>
-        <w:t>Logic@l</w:t>
-      </w:r>
-      <w:proofErr w:type="spellEnd"/>
+        <w:t>l’entreprise Logic@l</w:t>
+      </w:r>
       <w:r>
         <w:rPr>
           <w:color w:val="5B9BD4"/>
@@ -1184,7 +1163,7 @@
           </mc:Choice>
           <mc:Fallback>
             <w:pict>
-              <v:shape w14:anchorId="0300CED7" id="Graphic 14" o:spid="_x0000_s1026" style="position:absolute;margin-left:113.8pt;margin-top:11.7pt;width:369.95pt;height:.5pt;z-index:-15726592;visibility:visible;mso-wrap-style:square;mso-wrap-distance-left:0;mso-wrap-distance-top:0;mso-wrap-distance-right:0;mso-wrap-distance-bottom:0;mso-position-horizontal:absolute;mso-position-horizontal-relative:page;mso-position-vertical:absolute;mso-position-vertical-relative:text;v-text-anchor:top" coordsize="4698365,6350" o:gfxdata="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" path="m4697857,l,,,6096r4697857,l4697857,xe" fillcolor="#5b9bd4" stroked="f">
+              <v:shape w14:anchorId="584A4E43" id="Graphic 14" o:spid="_x0000_s1026" style="position:absolute;margin-left:113.8pt;margin-top:11.7pt;width:369.95pt;height:.5pt;z-index:-15726592;visibility:visible;mso-wrap-style:square;mso-wrap-distance-left:0;mso-wrap-distance-top:0;mso-wrap-distance-right:0;mso-wrap-distance-bottom:0;mso-position-horizontal:absolute;mso-position-horizontal-relative:page;mso-position-vertical:absolute;mso-position-vertical-relative:text;v-text-anchor:top" coordsize="4698365,6350" o:gfxdata="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" path="m4697857,l,,,6096r4697857,l4697857,xe" fillcolor="#5b9bd4" stroked="f">
                 <v:path arrowok="t"/>
                 <w10:wrap type="topAndBottom" anchorx="page"/>
               </v:shape>
@@ -1233,14 +1212,12 @@
         </w:rPr>
         <w:t xml:space="preserve"> </w:t>
       </w:r>
-      <w:proofErr w:type="spellStart"/>
       <w:r>
         <w:rPr>
           <w:color w:val="233E5F"/>
         </w:rPr>
         <w:t>Logic@l</w:t>
       </w:r>
-      <w:proofErr w:type="spellEnd"/>
       <w:r>
         <w:rPr>
           <w:color w:val="233E5F"/>
@@ -1276,13 +1253,8 @@
         <w:ind w:left="23" w:right="152"/>
         <w:jc w:val="both"/>
       </w:pPr>
-      <w:proofErr w:type="spellStart"/>
-      <w:r>
-        <w:t>Logic@l</w:t>
-      </w:r>
-      <w:proofErr w:type="spellEnd"/>
-      <w:r>
-        <w:t xml:space="preserve"> Conseils est une ESN ou entreprise de services numérique, il s’agit d’une entreprise spécialisée dans la prestation informatique pour les entreprises.</w:t>
+      <w:r>
+        <w:t>Logic@l Conseils est une ESN ou entreprise de services numérique, il s’agit d’une entreprise spécialisée dans la prestation informatique pour les entreprises.</w:t>
       </w:r>
       <w:r>
         <w:rPr>
@@ -1362,14 +1334,12 @@
         </w:rPr>
         <w:t xml:space="preserve"> </w:t>
       </w:r>
-      <w:proofErr w:type="spellStart"/>
       <w:r>
         <w:rPr>
           <w:color w:val="233E5F"/>
         </w:rPr>
         <w:t>Logic@l</w:t>
       </w:r>
-      <w:proofErr w:type="spellEnd"/>
       <w:r>
         <w:rPr>
           <w:color w:val="233E5F"/>
@@ -1948,21 +1918,7 @@
         <w:rPr>
           <w:sz w:val="26"/>
         </w:rPr>
-        <w:t xml:space="preserve">plusieurs formats comme des articles, des </w:t>
-      </w:r>
-      <w:proofErr w:type="spellStart"/>
-      <w:r>
-        <w:rPr>
-          <w:sz w:val="26"/>
-        </w:rPr>
-        <w:t>posts</w:t>
-      </w:r>
-      <w:proofErr w:type="spellEnd"/>
-      <w:r>
-        <w:rPr>
-          <w:sz w:val="26"/>
-        </w:rPr>
-        <w:t xml:space="preserve"> sur les réseaux sociaux, etc....</w:t>
+        <w:t>plusieurs formats comme des articles, des posts sur les réseaux sociaux, etc....</w:t>
       </w:r>
     </w:p>
     <w:p>
@@ -1991,8 +1947,16 @@
     </w:p>
     <w:p>
       <w:pPr>
-        <w:pStyle w:val="Corpsdetexte"/>
-        <w:spacing w:before="1"/>
+        <w:pStyle w:val="Paragraphedeliste"/>
+        <w:tabs>
+          <w:tab w:val="left" w:pos="729"/>
+        </w:tabs>
+        <w:spacing w:before="2" w:line="259" w:lineRule="auto"/>
+        <w:ind w:left="729" w:right="158" w:firstLine="0"/>
+        <w:jc w:val="both"/>
+        <w:rPr>
+          <w:sz w:val="26"/>
+        </w:rPr>
       </w:pPr>
     </w:p>
     <w:p>
@@ -2175,11 +2139,9 @@
         </w:rPr>
         <w:t xml:space="preserve"> </w:t>
       </w:r>
-      <w:proofErr w:type="spellStart"/>
       <w:r>
         <w:t>Logic@l</w:t>
       </w:r>
-      <w:proofErr w:type="spellEnd"/>
       <w:r>
         <w:rPr>
           <w:spacing w:val="-7"/>
@@ -2267,7 +2229,6 @@
         </w:rPr>
         <w:t xml:space="preserve"> </w:t>
       </w:r>
-      <w:proofErr w:type="spellStart"/>
       <w:r>
         <w:rPr>
           <w:spacing w:val="-2"/>
@@ -2275,7 +2236,6 @@
         </w:rPr>
         <w:t>Retail</w:t>
       </w:r>
-      <w:proofErr w:type="spellEnd"/>
     </w:p>
     <w:p>
       <w:pPr>
@@ -2293,7 +2253,6 @@
           <w:sz w:val="26"/>
         </w:rPr>
       </w:pPr>
-      <w:proofErr w:type="spellStart"/>
       <w:r>
         <w:rPr>
           <w:spacing w:val="-4"/>
@@ -2301,7 +2260,6 @@
         </w:rPr>
         <w:t>Adeo</w:t>
       </w:r>
-      <w:proofErr w:type="spellEnd"/>
     </w:p>
     <w:p>
       <w:pPr>
@@ -2788,11 +2746,9 @@
         </w:rPr>
         <w:t xml:space="preserve"> </w:t>
       </w:r>
-      <w:proofErr w:type="spellStart"/>
       <w:r>
         <w:t>Logic@l</w:t>
       </w:r>
-      <w:proofErr w:type="spellEnd"/>
       <w:r>
         <w:rPr>
           <w:spacing w:val="-7"/>
@@ -2867,7 +2823,6 @@
           <w:sz w:val="26"/>
         </w:rPr>
       </w:pPr>
-      <w:proofErr w:type="spellStart"/>
       <w:r>
         <w:rPr>
           <w:spacing w:val="-2"/>
@@ -2875,7 +2830,6 @@
         </w:rPr>
         <w:t>Stambia</w:t>
       </w:r>
-      <w:proofErr w:type="spellEnd"/>
     </w:p>
     <w:p>
       <w:pPr>
@@ -2917,7 +2871,6 @@
           <w:sz w:val="26"/>
         </w:rPr>
       </w:pPr>
-      <w:proofErr w:type="spellStart"/>
       <w:r>
         <w:rPr>
           <w:spacing w:val="-2"/>
@@ -2925,7 +2878,6 @@
         </w:rPr>
         <w:t>Semarchy</w:t>
       </w:r>
-      <w:proofErr w:type="spellEnd"/>
     </w:p>
     <w:p>
       <w:pPr>
@@ -2943,7 +2895,6 @@
           <w:sz w:val="26"/>
         </w:rPr>
       </w:pPr>
-      <w:proofErr w:type="spellStart"/>
       <w:r>
         <w:rPr>
           <w:spacing w:val="-2"/>
@@ -2951,7 +2902,6 @@
         </w:rPr>
         <w:t>Snowflake</w:t>
       </w:r>
-      <w:proofErr w:type="spellEnd"/>
     </w:p>
     <w:p>
       <w:pPr>
@@ -3002,11 +2952,9 @@
         <w:ind w:left="18" w:right="270" w:hanging="10"/>
         <w:jc w:val="both"/>
       </w:pPr>
-      <w:proofErr w:type="spellStart"/>
       <w:r>
         <w:t>Logic@l</w:t>
       </w:r>
-      <w:proofErr w:type="spellEnd"/>
       <w:r>
         <w:rPr>
           <w:spacing w:val="-4"/>
@@ -3111,83 +3059,20 @@
           <w:b/>
           <w:sz w:val="26"/>
         </w:rPr>
-        <w:t xml:space="preserve">Software </w:t>
-      </w:r>
-      <w:proofErr w:type="gramStart"/>
-      <w:r>
-        <w:rPr>
-          <w:b/>
-          <w:sz w:val="26"/>
-        </w:rPr>
-        <w:t>Engineering</w:t>
-      </w:r>
-      <w:r>
-        <w:rPr>
-          <w:sz w:val="26"/>
-        </w:rPr>
-        <w:t>:</w:t>
-      </w:r>
-      <w:proofErr w:type="gramEnd"/>
-      <w:r>
-        <w:rPr>
-          <w:sz w:val="26"/>
-        </w:rPr>
-        <w:t xml:space="preserve"> pôle se concentrant </w:t>
-      </w:r>
-      <w:r>
-        <w:rPr>
-          <w:color w:val="1F1F1F"/>
-          <w:sz w:val="26"/>
-        </w:rPr>
-        <w:t xml:space="preserve">sur les langages de programmation et </w:t>
-      </w:r>
-      <w:proofErr w:type="spellStart"/>
-      <w:r>
-        <w:rPr>
-          <w:color w:val="1F1F1F"/>
-          <w:sz w:val="26"/>
-        </w:rPr>
-        <w:t>Frameworks</w:t>
-      </w:r>
-      <w:proofErr w:type="spellEnd"/>
-      <w:r>
-        <w:rPr>
-          <w:color w:val="1F1F1F"/>
-          <w:sz w:val="26"/>
-        </w:rPr>
-        <w:t xml:space="preserve"> d’aujourd’hui et de demain. Les architectes de ce pôle sont principalement orientés vers le </w:t>
-      </w:r>
-      <w:proofErr w:type="spellStart"/>
-      <w:r>
-        <w:rPr>
-          <w:color w:val="1F1F1F"/>
-          <w:sz w:val="26"/>
-        </w:rPr>
-        <w:t>back-end</w:t>
-      </w:r>
-      <w:proofErr w:type="spellEnd"/>
-      <w:r>
-        <w:rPr>
-          <w:color w:val="1F1F1F"/>
-          <w:sz w:val="26"/>
-        </w:rPr>
-        <w:t xml:space="preserve"> avec Python et Java, avec quelques notes de </w:t>
-      </w:r>
-      <w:proofErr w:type="spellStart"/>
-      <w:r>
-        <w:rPr>
-          <w:color w:val="1F1F1F"/>
-          <w:sz w:val="26"/>
-        </w:rPr>
-        <w:t>front-end</w:t>
-      </w:r>
-      <w:proofErr w:type="spellEnd"/>
-      <w:r>
-        <w:rPr>
-          <w:color w:val="1F1F1F"/>
-          <w:sz w:val="26"/>
-        </w:rPr>
-        <w:t xml:space="preserve"> grâce à Javascript.</w:t>
+        <w:t>Software Engineering</w:t>
+      </w:r>
+      <w:r>
+        <w:rPr>
+          <w:sz w:val="26"/>
+        </w:rPr>
+        <w:t xml:space="preserve">: pôle se concentrant </w:t>
+      </w:r>
+      <w:r>
+        <w:rPr>
+          <w:color w:val="1F1F1F"/>
+          <w:sz w:val="26"/>
+        </w:rPr>
+        <w:t>sur les langages de programmation et Frameworks d’aujourd’hui et de demain. Les architectes de ce pôle sont principalement orientés vers le back-end avec Python et Java, avec quelques notes de front-end grâce à Javascript.</w:t>
       </w:r>
     </w:p>
     <w:p>
@@ -3228,7 +3113,6 @@
         </w:rPr>
         <w:t xml:space="preserve">pôle se concentrant sur l’analyse, plus précisément sur ces 4 </w:t>
       </w:r>
-      <w:proofErr w:type="gramStart"/>
       <w:r>
         <w:rPr>
           <w:color w:val="1F1F1F"/>
@@ -3237,7 +3121,6 @@
         </w:rPr>
         <w:t>points:</w:t>
       </w:r>
-      <w:proofErr w:type="gramEnd"/>
     </w:p>
     <w:p>
       <w:pPr>
@@ -3634,21 +3517,7 @@
         <w:rPr>
           <w:sz w:val="26"/>
         </w:rPr>
-        <w:t xml:space="preserve">les diffuser. Choisir la de </w:t>
-      </w:r>
-      <w:proofErr w:type="spellStart"/>
-      <w:r>
-        <w:rPr>
-          <w:sz w:val="26"/>
-        </w:rPr>
-        <w:t>Reporting</w:t>
-      </w:r>
-      <w:proofErr w:type="spellEnd"/>
-      <w:r>
-        <w:rPr>
-          <w:sz w:val="26"/>
-        </w:rPr>
-        <w:t xml:space="preserve"> et de gestion de flux de données.</w:t>
+        <w:t>les diffuser. Choisir la de Reporting et de gestion de flux de données.</w:t>
       </w:r>
     </w:p>
     <w:p>
@@ -4550,25 +4419,7 @@
           <w:color w:val="1F1F1F"/>
           <w:sz w:val="26"/>
         </w:rPr>
-        <w:t xml:space="preserve">Data </w:t>
-      </w:r>
-      <w:proofErr w:type="spellStart"/>
-      <w:r>
-        <w:rPr>
-          <w:b/>
-          <w:color w:val="1F1F1F"/>
-          <w:sz w:val="26"/>
-        </w:rPr>
-        <w:t>Quality</w:t>
-      </w:r>
-      <w:proofErr w:type="spellEnd"/>
-      <w:r>
-        <w:rPr>
-          <w:b/>
-          <w:color w:val="1F1F1F"/>
-          <w:sz w:val="26"/>
-        </w:rPr>
-        <w:t xml:space="preserve"> </w:t>
+        <w:t xml:space="preserve">Data Quality </w:t>
       </w:r>
       <w:r>
         <w:rPr>
@@ -4628,8 +4479,6 @@
         </w:rPr>
         <w:t xml:space="preserve"> </w:t>
       </w:r>
-      <w:proofErr w:type="spellStart"/>
-      <w:proofErr w:type="gramStart"/>
       <w:r>
         <w:rPr>
           <w:b/>
@@ -4638,21 +4487,12 @@
         </w:rPr>
         <w:t>Governance</w:t>
       </w:r>
-      <w:proofErr w:type="spellEnd"/>
-      <w:r>
-        <w:rPr>
-          <w:color w:val="1F1F1F"/>
-          <w:sz w:val="26"/>
-        </w:rPr>
-        <w:t>:</w:t>
-      </w:r>
-      <w:proofErr w:type="gramEnd"/>
-      <w:r>
-        <w:rPr>
-          <w:color w:val="1F1F1F"/>
-          <w:sz w:val="26"/>
-        </w:rPr>
-        <w:t xml:space="preserve"> </w:t>
+      <w:r>
+        <w:rPr>
+          <w:color w:val="1F1F1F"/>
+          <w:sz w:val="26"/>
+        </w:rPr>
+        <w:t xml:space="preserve">: </w:t>
       </w:r>
       <w:r>
         <w:rPr>
@@ -4954,7 +4794,6 @@
         </w:rPr>
         <w:t xml:space="preserve"> </w:t>
       </w:r>
-      <w:proofErr w:type="spellStart"/>
       <w:r>
         <w:rPr>
           <w:color w:val="1F1F1F"/>
@@ -4962,7 +4801,6 @@
         </w:rPr>
         <w:t>reporting</w:t>
       </w:r>
-      <w:proofErr w:type="spellEnd"/>
       <w:r>
         <w:rPr>
           <w:color w:val="1F1F1F"/>
@@ -6170,37 +6008,12 @@
                 <w:sz w:val="24"/>
               </w:rPr>
             </w:pPr>
-            <w:proofErr w:type="gramStart"/>
             <w:r>
               <w:rPr>
                 <w:color w:val="1F1F1F"/>
                 <w:sz w:val="24"/>
               </w:rPr>
-              <w:t>et</w:t>
-            </w:r>
-            <w:proofErr w:type="gramEnd"/>
-            <w:r>
-              <w:rPr>
-                <w:color w:val="1F1F1F"/>
-                <w:sz w:val="24"/>
-              </w:rPr>
-              <w:t xml:space="preserve">, dans certains cas, désigner un Data Protection </w:t>
-            </w:r>
-            <w:proofErr w:type="spellStart"/>
-            <w:r>
-              <w:rPr>
-                <w:color w:val="1F1F1F"/>
-                <w:sz w:val="24"/>
-              </w:rPr>
-              <w:t>Officer</w:t>
-            </w:r>
-            <w:proofErr w:type="spellEnd"/>
-            <w:r>
-              <w:rPr>
-                <w:color w:val="1F1F1F"/>
-                <w:sz w:val="24"/>
-              </w:rPr>
-              <w:t xml:space="preserve"> (DPO), surtout si elles traitent des données sensibles.</w:t>
+              <w:t>et, dans certains cas, désigner un Data Protection Officer (DPO), surtout si elles traitent des données sensibles.</w:t>
             </w:r>
           </w:p>
         </w:tc>
@@ -6229,23 +6042,13 @@
           <w:sz w:val="24"/>
         </w:rPr>
       </w:pPr>
-      <w:proofErr w:type="spellStart"/>
       <w:r>
         <w:rPr>
           <w:b/>
           <w:color w:val="1F1F1F"/>
           <w:sz w:val="26"/>
         </w:rPr>
-        <w:t>Pseudonymisation</w:t>
-      </w:r>
-      <w:proofErr w:type="spellEnd"/>
-      <w:r>
-        <w:rPr>
-          <w:b/>
-          <w:color w:val="1F1F1F"/>
-          <w:sz w:val="26"/>
-        </w:rPr>
-        <w:t xml:space="preserve"> </w:t>
+        <w:t xml:space="preserve">Pseudonymisation </w:t>
       </w:r>
       <w:r>
         <w:rPr>
@@ -6435,23 +6238,7 @@
           <w:color w:val="1F1F1F"/>
           <w:sz w:val="24"/>
         </w:rPr>
-        <w:t xml:space="preserve">employés. Dans ce cas, la </w:t>
-      </w:r>
-      <w:proofErr w:type="spellStart"/>
-      <w:r>
-        <w:rPr>
-          <w:color w:val="1F1F1F"/>
-          <w:sz w:val="24"/>
-        </w:rPr>
-        <w:t>pseudonymisation</w:t>
-      </w:r>
-      <w:proofErr w:type="spellEnd"/>
-      <w:r>
-        <w:rPr>
-          <w:color w:val="1F1F1F"/>
-          <w:sz w:val="24"/>
-        </w:rPr>
-        <w:t xml:space="preserve"> peut être utilisée pour remplacer certains attributs</w:t>
+        <w:t>employés. Dans ce cas, la pseudonymisation peut être utilisée pour remplacer certains attributs</w:t>
       </w:r>
       <w:r>
         <w:rPr>
@@ -6673,7 +6460,6 @@
         </w:rPr>
         <w:t xml:space="preserve"> </w:t>
       </w:r>
-      <w:proofErr w:type="spellStart"/>
       <w:r>
         <w:rPr>
           <w:b/>
@@ -6683,7 +6469,6 @@
         </w:rPr>
         <w:t>Pseudonymisation</w:t>
       </w:r>
-      <w:proofErr w:type="spellEnd"/>
     </w:p>
     <w:p>
       <w:pPr>
@@ -6716,39 +6501,7 @@
           <w:color w:val="1F1F1F"/>
           <w:sz w:val="26"/>
         </w:rPr>
-        <w:t xml:space="preserve">: La </w:t>
-      </w:r>
-      <w:proofErr w:type="spellStart"/>
-      <w:r>
-        <w:rPr>
-          <w:color w:val="1F1F1F"/>
-          <w:sz w:val="26"/>
-        </w:rPr>
-        <w:t>pseudonymisation</w:t>
-      </w:r>
-      <w:proofErr w:type="spellEnd"/>
-      <w:r>
-        <w:rPr>
-          <w:color w:val="1F1F1F"/>
-          <w:sz w:val="26"/>
-        </w:rPr>
-        <w:t xml:space="preserve"> est recommandée par le Règlement Général sur la Protection des Données (RGPD). Le RGPD est plus souple avec les données </w:t>
-      </w:r>
-      <w:proofErr w:type="spellStart"/>
-      <w:r>
-        <w:rPr>
-          <w:color w:val="1F1F1F"/>
-          <w:sz w:val="26"/>
-        </w:rPr>
-        <w:t>pseudonymisées</w:t>
-      </w:r>
-      <w:proofErr w:type="spellEnd"/>
-      <w:r>
-        <w:rPr>
-          <w:color w:val="1F1F1F"/>
-          <w:sz w:val="26"/>
-        </w:rPr>
-        <w:t xml:space="preserve"> par rapport aux données personnelles non traitées, ce qui en fait une technique avantageuse pour le traitement des </w:t>
+        <w:t xml:space="preserve">: La pseudonymisation est recommandée par le Règlement Général sur la Protection des Données (RGPD). Le RGPD est plus souple avec les données pseudonymisées par rapport aux données personnelles non traitées, ce qui en fait une technique avantageuse pour le traitement des </w:t>
       </w:r>
       <w:r>
         <w:rPr>
@@ -6811,23 +6564,7 @@
           <w:color w:val="1F1F1F"/>
           <w:sz w:val="26"/>
         </w:rPr>
-        <w:t xml:space="preserve">: En cas de violation de données </w:t>
-      </w:r>
-      <w:proofErr w:type="spellStart"/>
-      <w:r>
-        <w:rPr>
-          <w:color w:val="1F1F1F"/>
-          <w:sz w:val="26"/>
-        </w:rPr>
-        <w:t>pseudonymisées</w:t>
-      </w:r>
-      <w:proofErr w:type="spellEnd"/>
-      <w:r>
-        <w:rPr>
-          <w:color w:val="1F1F1F"/>
-          <w:sz w:val="26"/>
-        </w:rPr>
-        <w:t>, l'impact sur les personnes concernées est moindre par rapport à</w:t>
+        <w:t>: En cas de violation de données pseudonymisées, l'impact sur les personnes concernées est moindre par rapport à</w:t>
       </w:r>
       <w:r>
         <w:rPr>
@@ -7941,14 +7678,12 @@
         </w:rPr>
         <w:t xml:space="preserve"> </w:t>
       </w:r>
-      <w:proofErr w:type="spellStart"/>
       <w:r>
         <w:rPr>
           <w:color w:val="233E5F"/>
         </w:rPr>
         <w:t>Logic@l</w:t>
       </w:r>
-      <w:proofErr w:type="spellEnd"/>
       <w:r>
         <w:rPr>
           <w:color w:val="233E5F"/>
@@ -8035,14 +7770,12 @@
         <w:spacing w:before="320"/>
         <w:ind w:left="9"/>
       </w:pPr>
-      <w:proofErr w:type="spellStart"/>
       <w:r>
         <w:rPr>
           <w:color w:val="1F1F1F"/>
         </w:rPr>
         <w:t>Logic@l</w:t>
       </w:r>
-      <w:proofErr w:type="spellEnd"/>
       <w:r>
         <w:rPr>
           <w:color w:val="1F1F1F"/>
@@ -8615,11 +8348,9 @@
         <w:spacing w:line="261" w:lineRule="auto"/>
         <w:ind w:left="736" w:right="140"/>
       </w:pPr>
-      <w:proofErr w:type="gramStart"/>
       <w:r>
         <w:t>maîtriser</w:t>
       </w:r>
-      <w:proofErr w:type="gramEnd"/>
       <w:r>
         <w:rPr>
           <w:spacing w:val="-4"/>
@@ -8758,14 +8489,12 @@
         </w:rPr>
         <w:t xml:space="preserve"> </w:t>
       </w:r>
-      <w:proofErr w:type="spellStart"/>
       <w:r>
         <w:rPr>
           <w:color w:val="233E5F"/>
         </w:rPr>
         <w:t>Logic@l</w:t>
       </w:r>
-      <w:proofErr w:type="spellEnd"/>
       <w:r>
         <w:rPr>
           <w:color w:val="233E5F"/>
@@ -8856,21 +8585,7 @@
         <w:rPr>
           <w:color w:val="1F1F1F"/>
         </w:rPr>
-        <w:t xml:space="preserve">Les consultants de </w:t>
-      </w:r>
-      <w:proofErr w:type="spellStart"/>
-      <w:r>
-        <w:rPr>
-          <w:color w:val="1F1F1F"/>
-        </w:rPr>
-        <w:t>Logic@l</w:t>
-      </w:r>
-      <w:proofErr w:type="spellEnd"/>
-      <w:r>
-        <w:rPr>
-          <w:color w:val="1F1F1F"/>
-        </w:rPr>
-        <w:t xml:space="preserve"> Conseils effectuent leur veille technologique via plusieurs méthodes :</w:t>
+        <w:t>Les consultants de Logic@l Conseils effectuent leur veille technologique via plusieurs méthodes :</w:t>
       </w:r>
     </w:p>
     <w:p>
@@ -9421,7 +9136,7 @@
           </mc:Choice>
           <mc:Fallback>
             <w:pict>
-              <v:group w14:anchorId="702CB44A" id="Group 19" o:spid="_x0000_s1026" style="width:369.95pt;height:.5pt;mso-position-horizontal-relative:char;mso-position-vertical-relative:line" coordsize="46983,63" o:gfxdata="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">
+              <v:group w14:anchorId="4B3398EE" id="Group 19" o:spid="_x0000_s1026" style="width:369.95pt;height:.5pt;mso-position-horizontal-relative:char;mso-position-vertical-relative:line" coordsize="46983,63" o:gfxdata="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">
                 <v:shape id="Graphic 20" o:spid="_x0000_s1027" style="position:absolute;width:46983;height:63;visibility:visible;mso-wrap-style:square;v-text-anchor:top" coordsize="4698365,6350" o:gfxdata="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" path="m4697857,l,,,6096r4697857,l4697857,xe" fillcolor="#5b9bd4" stroked="f">
                   <v:path arrowok="t"/>
                 </v:shape>
@@ -9557,7 +9272,7 @@
           </mc:Choice>
           <mc:Fallback>
             <w:pict>
-              <v:shape w14:anchorId="7D863A89" id="Graphic 21" o:spid="_x0000_s1026" style="position:absolute;margin-left:113.8pt;margin-top:11.35pt;width:369.95pt;height:.5pt;z-index:-15725568;visibility:visible;mso-wrap-style:square;mso-wrap-distance-left:0;mso-wrap-distance-top:0;mso-wrap-distance-right:0;mso-wrap-distance-bottom:0;mso-position-horizontal:absolute;mso-position-horizontal-relative:page;mso-position-vertical:absolute;mso-position-vertical-relative:text;v-text-anchor:top" coordsize="4698365,6350" o:gfxdata="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" path="m4697857,l,,,6096r4697857,l4697857,xe" fillcolor="#5b9bd4" stroked="f">
+              <v:shape w14:anchorId="6D6CCE86" id="Graphic 21" o:spid="_x0000_s1026" style="position:absolute;margin-left:113.8pt;margin-top:11.35pt;width:369.95pt;height:.5pt;z-index:-15725568;visibility:visible;mso-wrap-style:square;mso-wrap-distance-left:0;mso-wrap-distance-top:0;mso-wrap-distance-right:0;mso-wrap-distance-bottom:0;mso-position-horizontal:absolute;mso-position-horizontal-relative:page;mso-position-vertical:absolute;mso-position-vertical-relative:text;v-text-anchor:top" coordsize="4698365,6350" o:gfxdata="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" path="m4697857,l,,,6096r4697857,l4697857,xe" fillcolor="#5b9bd4" stroked="f">
                 <v:path arrowok="t"/>
                 <w10:wrap type="topAndBottom" anchorx="page"/>
               </v:shape>
@@ -9715,69 +9430,41 @@
     </w:p>
     <w:p>
       <w:pPr>
-        <w:pStyle w:val="Corpsdetexte"/>
-        <w:spacing w:line="261" w:lineRule="auto"/>
-        <w:ind w:left="18" w:right="140" w:hanging="10"/>
-      </w:pPr>
-      <w:r>
-        <w:rPr>
-          <w:color w:val="1F1F1F"/>
-        </w:rPr>
-        <w:t>Pour aider le pôle Support comme le support Commercial et Recrutement a trouvé les profils des collaborateurs plus facilement pour les missions données par les clients.</w:t>
-      </w:r>
-    </w:p>
-    <w:p>
-      <w:pPr>
-        <w:pStyle w:val="Corpsdetexte"/>
-        <w:spacing w:before="4" w:line="261" w:lineRule="auto"/>
-        <w:ind w:left="18" w:right="45" w:hanging="10"/>
-      </w:pPr>
-      <w:r>
-        <w:rPr>
-          <w:color w:val="1F1F1F"/>
-        </w:rPr>
-        <w:t xml:space="preserve">La mission a été de remplir les données d’une </w:t>
-      </w:r>
-      <w:proofErr w:type="spellStart"/>
-      <w:r>
-        <w:rPr>
-          <w:color w:val="1F1F1F"/>
-        </w:rPr>
-        <w:t>CVTech</w:t>
-      </w:r>
-      <w:proofErr w:type="spellEnd"/>
-      <w:r>
-        <w:rPr>
-          <w:color w:val="1F1F1F"/>
-        </w:rPr>
-        <w:t xml:space="preserve"> qui génère les CV de chaque</w:t>
-      </w:r>
-      <w:r>
-        <w:rPr>
-          <w:color w:val="1F1F1F"/>
-          <w:spacing w:val="80"/>
-        </w:rPr>
-        <w:t xml:space="preserve"> </w:t>
-      </w:r>
-      <w:r>
-        <w:rPr>
-          <w:color w:val="1F1F1F"/>
-        </w:rPr>
-        <w:t xml:space="preserve">collaborateur afin qu'avec un </w:t>
-      </w:r>
-      <w:proofErr w:type="spellStart"/>
-      <w:r>
-        <w:rPr>
-          <w:color w:val="1F1F1F"/>
-        </w:rPr>
-        <w:t>ChatBot</w:t>
-      </w:r>
-      <w:proofErr w:type="spellEnd"/>
-      <w:r>
-        <w:rPr>
-          <w:color w:val="1F1F1F"/>
-        </w:rPr>
-        <w:t xml:space="preserve"> on puisse trouver le profil adéquat.</w:t>
+        <w:widowControl/>
+        <w:autoSpaceDE/>
+        <w:autoSpaceDN/>
+        <w:rPr>
+          <w:sz w:val="26"/>
+          <w:szCs w:val="26"/>
+          <w:lang w:eastAsia="fr-FR"/>
+        </w:rPr>
+      </w:pPr>
+      <w:r>
+        <w:rPr>
+          <w:color w:val="000000"/>
+          <w:sz w:val="26"/>
+          <w:szCs w:val="26"/>
+          <w:lang w:eastAsia="fr-FR"/>
+        </w:rPr>
+        <w:t xml:space="preserve">Afin de faciliter l’accès aux clients de l’entreprise à des données libre d’accès venant d’API autour de différents domaines comme la météo ou bien le cours des matières premières, le but est </w:t>
+      </w:r>
+      <w:r>
+        <w:rPr>
+          <w:color w:val="000000"/>
+          <w:sz w:val="26"/>
+          <w:szCs w:val="26"/>
+          <w:lang w:eastAsia="fr-FR"/>
+        </w:rPr>
+        <w:t>de créer</w:t>
+      </w:r>
+      <w:r>
+        <w:rPr>
+          <w:color w:val="000000"/>
+          <w:sz w:val="26"/>
+          <w:szCs w:val="26"/>
+          <w:lang w:eastAsia="fr-FR"/>
+        </w:rPr>
+        <w:t xml:space="preserve"> une application utilisant une API regroupant plusieurs données d’autres API qui récoltera les données avec les mises à jour de manière continuelle et en temps réel.</w:t>
       </w:r>
     </w:p>
     <w:p>
@@ -9848,172 +9535,13 @@
         <w:rPr>
           <w:color w:val="1F1F1F"/>
         </w:rPr>
-        <w:t>mission</w:t>
-      </w:r>
-      <w:r>
-        <w:rPr>
-          <w:color w:val="1F1F1F"/>
-          <w:spacing w:val="-2"/>
-        </w:rPr>
-        <w:t xml:space="preserve"> </w:t>
-      </w:r>
-      <w:r>
-        <w:rPr>
-          <w:color w:val="1F1F1F"/>
-        </w:rPr>
-        <w:t>de</w:t>
-      </w:r>
-      <w:r>
-        <w:rPr>
-          <w:color w:val="1F1F1F"/>
-          <w:spacing w:val="-4"/>
-        </w:rPr>
-        <w:t xml:space="preserve"> </w:t>
-      </w:r>
-      <w:r>
-        <w:rPr>
-          <w:color w:val="1F1F1F"/>
-        </w:rPr>
-        <w:t>créer</w:t>
-      </w:r>
-      <w:r>
-        <w:rPr>
-          <w:color w:val="1F1F1F"/>
-          <w:spacing w:val="-1"/>
-        </w:rPr>
-        <w:t xml:space="preserve"> </w:t>
-      </w:r>
-      <w:r>
-        <w:rPr>
-          <w:color w:val="1F1F1F"/>
-        </w:rPr>
-        <w:t>une</w:t>
-      </w:r>
-      <w:r>
-        <w:rPr>
-          <w:color w:val="1F1F1F"/>
-          <w:spacing w:val="-1"/>
-        </w:rPr>
-        <w:t xml:space="preserve"> </w:t>
-      </w:r>
-      <w:r>
-        <w:rPr>
-          <w:color w:val="1F1F1F"/>
-        </w:rPr>
-        <w:t>boîte</w:t>
-      </w:r>
-      <w:r>
-        <w:rPr>
-          <w:color w:val="1F1F1F"/>
-          <w:spacing w:val="-4"/>
-        </w:rPr>
-        <w:t xml:space="preserve"> </w:t>
-      </w:r>
-      <w:r>
-        <w:rPr>
-          <w:color w:val="1F1F1F"/>
-        </w:rPr>
-        <w:t>à</w:t>
-      </w:r>
-      <w:r>
-        <w:rPr>
-          <w:color w:val="1F1F1F"/>
-          <w:spacing w:val="-4"/>
-        </w:rPr>
-        <w:t xml:space="preserve"> </w:t>
-      </w:r>
-      <w:r>
-        <w:rPr>
-          <w:color w:val="1F1F1F"/>
-        </w:rPr>
-        <w:t>outils</w:t>
-      </w:r>
-      <w:r>
-        <w:rPr>
-          <w:color w:val="1F1F1F"/>
-          <w:spacing w:val="-4"/>
-        </w:rPr>
-        <w:t xml:space="preserve"> </w:t>
-      </w:r>
-      <w:r>
-        <w:rPr>
-          <w:color w:val="1F1F1F"/>
-        </w:rPr>
-        <w:t>visant</w:t>
-      </w:r>
-      <w:r>
-        <w:rPr>
-          <w:color w:val="1F1F1F"/>
-          <w:spacing w:val="-4"/>
-        </w:rPr>
-        <w:t xml:space="preserve"> </w:t>
-      </w:r>
-      <w:r>
-        <w:rPr>
-          <w:color w:val="1F1F1F"/>
-        </w:rPr>
-        <w:t>à</w:t>
-      </w:r>
-      <w:r>
-        <w:rPr>
-          <w:color w:val="1F1F1F"/>
-          <w:spacing w:val="-1"/>
-        </w:rPr>
-        <w:t xml:space="preserve"> </w:t>
-      </w:r>
-      <w:r>
-        <w:rPr>
-          <w:color w:val="1F1F1F"/>
-        </w:rPr>
-        <w:t>alimenter</w:t>
-      </w:r>
-      <w:r>
-        <w:rPr>
-          <w:color w:val="1F1F1F"/>
-          <w:spacing w:val="-4"/>
-        </w:rPr>
-        <w:t xml:space="preserve"> </w:t>
-      </w:r>
-      <w:r>
-        <w:rPr>
-          <w:color w:val="1F1F1F"/>
-        </w:rPr>
-        <w:t>le</w:t>
-      </w:r>
-      <w:r>
-        <w:rPr>
-          <w:color w:val="1F1F1F"/>
-          <w:spacing w:val="-1"/>
-        </w:rPr>
-        <w:t xml:space="preserve"> </w:t>
-      </w:r>
-      <w:proofErr w:type="spellStart"/>
-      <w:r>
-        <w:rPr>
-          <w:color w:val="1F1F1F"/>
-        </w:rPr>
-        <w:t>ChatBot</w:t>
-      </w:r>
-      <w:proofErr w:type="spellEnd"/>
-      <w:r>
-        <w:rPr>
-          <w:color w:val="1F1F1F"/>
-        </w:rPr>
-        <w:t xml:space="preserve"> et la </w:t>
-      </w:r>
-      <w:proofErr w:type="spellStart"/>
-      <w:r>
-        <w:rPr>
-          <w:color w:val="1F1F1F"/>
-        </w:rPr>
-        <w:t>CVTech</w:t>
-      </w:r>
-      <w:proofErr w:type="spellEnd"/>
-      <w:r>
-        <w:rPr>
-          <w:color w:val="1F1F1F"/>
-        </w:rPr>
-        <w:t>.</w:t>
+        <w:t>missions au fil de la réalisation de chercher des données liées à plusieurs</w:t>
+      </w:r>
+      <w:r>
+        <w:rPr>
+          <w:color w:val="1F1F1F"/>
+        </w:rPr>
+        <w:t>, de les évaluer au niveau de la pertinence, de les récolter et de les afficher</w:t>
       </w:r>
     </w:p>
     <w:p>
@@ -10128,7 +9656,7 @@
         <w:rPr>
           <w:color w:val="1F1F1F"/>
         </w:rPr>
-        <w:t>besoin</w:t>
+        <w:t>projet</w:t>
       </w:r>
       <w:r>
         <w:rPr>
@@ -10140,41 +9668,9 @@
       <w:r>
         <w:rPr>
           <w:color w:val="1F1F1F"/>
-        </w:rPr>
-        <w:t>vis-à-vis</w:t>
-      </w:r>
-      <w:r>
-        <w:rPr>
-          <w:color w:val="1F1F1F"/>
           <w:spacing w:val="-6"/>
         </w:rPr>
-        <w:t xml:space="preserve"> </w:t>
-      </w:r>
-      <w:r>
-        <w:rPr>
-          <w:color w:val="1F1F1F"/>
-        </w:rPr>
-        <w:t>du</w:t>
-      </w:r>
-      <w:r>
-        <w:rPr>
-          <w:color w:val="1F1F1F"/>
-          <w:spacing w:val="-6"/>
-        </w:rPr>
-        <w:t xml:space="preserve"> </w:t>
-      </w:r>
-      <w:r>
-        <w:rPr>
-          <w:color w:val="1F1F1F"/>
-        </w:rPr>
-        <w:t>projet</w:t>
-      </w:r>
-      <w:r>
-        <w:rPr>
-          <w:color w:val="1F1F1F"/>
-          <w:spacing w:val="-6"/>
-        </w:rPr>
-        <w:t xml:space="preserve"> </w:t>
+        <w:t>durant les principales étapes</w:t>
       </w:r>
       <w:r>
         <w:rPr>
@@ -10195,50 +9691,54 @@
       <w:r>
         <w:rPr>
           <w:noProof/>
-          <w:sz w:val="20"/>
         </w:rPr>
         <w:drawing>
-          <wp:anchor distT="0" distB="0" distL="0" distR="0" simplePos="0" relativeHeight="487591424" behindDoc="1" locked="0" layoutInCell="1" allowOverlap="1" wp14:anchorId="5969FDB7" wp14:editId="5237486B">
-            <wp:simplePos x="0" y="0"/>
-            <wp:positionH relativeFrom="page">
-              <wp:posOffset>949452</wp:posOffset>
-            </wp:positionH>
-            <wp:positionV relativeFrom="paragraph">
-              <wp:posOffset>205984</wp:posOffset>
-            </wp:positionV>
-            <wp:extent cx="5762257" cy="3240119"/>
-            <wp:effectExtent l="0" t="0" r="0" b="0"/>
-            <wp:wrapTopAndBottom/>
-            <wp:docPr id="22" name="Image 22"/>
+          <wp:inline distT="0" distB="0" distL="0" distR="0" wp14:anchorId="77A94192" wp14:editId="3626290F">
+            <wp:extent cx="5859780" cy="2243455"/>
+            <wp:effectExtent l="0" t="0" r="7620" b="4445"/>
+            <wp:docPr id="165845356" name="Image 18" descr="Une image contenant texte, capture d’écran, diagramme, nombre&#10;&#10;Le contenu généré par l’IA peut être incorrect."/>
             <wp:cNvGraphicFramePr>
-              <a:graphicFrameLocks xmlns:a="http://schemas.openxmlformats.org/drawingml/2006/main"/>
+              <a:graphicFrameLocks xmlns:a="http://schemas.openxmlformats.org/drawingml/2006/main" noChangeAspect="1"/>
             </wp:cNvGraphicFramePr>
             <a:graphic xmlns:a="http://schemas.openxmlformats.org/drawingml/2006/main">
               <a:graphicData uri="http://schemas.openxmlformats.org/drawingml/2006/picture">
                 <pic:pic xmlns:pic="http://schemas.openxmlformats.org/drawingml/2006/picture">
                   <pic:nvPicPr>
-                    <pic:cNvPr id="22" name="Image 22"/>
-                    <pic:cNvPicPr/>
+                    <pic:cNvPr id="165845356" name="Image 18" descr="Une image contenant texte, capture d’écran, diagramme, nombre&#10;&#10;Le contenu généré par l’IA peut être incorrect."/>
+                    <pic:cNvPicPr>
+                      <a:picLocks noChangeAspect="1" noChangeArrowheads="1"/>
+                    </pic:cNvPicPr>
                   </pic:nvPicPr>
                   <pic:blipFill>
-                    <a:blip r:embed="rId16" cstate="print"/>
+                    <a:blip r:embed="rId16">
+                      <a:extLst>
+                        <a:ext uri="{28A0092B-C50C-407E-A947-70E740481C1C}">
+                          <a14:useLocalDpi xmlns:a14="http://schemas.microsoft.com/office/drawing/2010/main" val="0"/>
+                        </a:ext>
+                      </a:extLst>
+                    </a:blip>
+                    <a:srcRect/>
                     <a:stretch>
                       <a:fillRect/>
                     </a:stretch>
                   </pic:blipFill>
-                  <pic:spPr>
+                  <pic:spPr bwMode="auto">
                     <a:xfrm>
                       <a:off x="0" y="0"/>
-                      <a:ext cx="5762257" cy="3240119"/>
+                      <a:ext cx="5859780" cy="2243455"/>
                     </a:xfrm>
                     <a:prstGeom prst="rect">
                       <a:avLst/>
                     </a:prstGeom>
+                    <a:noFill/>
+                    <a:ln>
+                      <a:noFill/>
+                    </a:ln>
                   </pic:spPr>
                 </pic:pic>
               </a:graphicData>
             </a:graphic>
-          </wp:anchor>
+          </wp:inline>
         </w:drawing>
       </w:r>
     </w:p>
@@ -10253,204 +9753,77 @@
         <w:pStyle w:val="Corpsdetexte"/>
         <w:spacing w:before="1" w:line="259" w:lineRule="auto"/>
         <w:ind w:left="33" w:right="140" w:hanging="10"/>
-      </w:pPr>
-      <w:r>
-        <w:t>Dans</w:t>
-      </w:r>
-      <w:r>
-        <w:rPr>
-          <w:spacing w:val="-3"/>
-        </w:rPr>
-        <w:t xml:space="preserve"> </w:t>
-      </w:r>
-      <w:r>
-        <w:t>le</w:t>
-      </w:r>
-      <w:r>
-        <w:rPr>
-          <w:spacing w:val="-3"/>
-        </w:rPr>
-        <w:t xml:space="preserve"> </w:t>
-      </w:r>
-      <w:r>
-        <w:t>cadre</w:t>
-      </w:r>
-      <w:r>
-        <w:rPr>
-          <w:spacing w:val="-3"/>
-        </w:rPr>
-        <w:t xml:space="preserve"> </w:t>
-      </w:r>
-      <w:r>
-        <w:t>de</w:t>
-      </w:r>
-      <w:r>
-        <w:rPr>
-          <w:spacing w:val="-3"/>
-        </w:rPr>
-        <w:t xml:space="preserve"> </w:t>
-      </w:r>
-      <w:r>
-        <w:t>la</w:t>
-      </w:r>
-      <w:r>
-        <w:rPr>
-          <w:spacing w:val="-1"/>
-        </w:rPr>
-        <w:t xml:space="preserve"> </w:t>
-      </w:r>
-      <w:r>
-        <w:t>mission</w:t>
-      </w:r>
-      <w:r>
-        <w:rPr>
-          <w:spacing w:val="-3"/>
-        </w:rPr>
-        <w:t xml:space="preserve"> </w:t>
-      </w:r>
-      <w:r>
-        <w:t>je</w:t>
-      </w:r>
-      <w:r>
-        <w:rPr>
-          <w:spacing w:val="-1"/>
-        </w:rPr>
-        <w:t xml:space="preserve"> </w:t>
-      </w:r>
-      <w:r>
-        <w:t>me</w:t>
-      </w:r>
-      <w:r>
-        <w:rPr>
-          <w:spacing w:val="-1"/>
-        </w:rPr>
-        <w:t xml:space="preserve"> </w:t>
-      </w:r>
-      <w:r>
-        <w:t>situe</w:t>
-      </w:r>
-      <w:r>
-        <w:rPr>
-          <w:spacing w:val="-3"/>
-        </w:rPr>
-        <w:t xml:space="preserve"> </w:t>
-      </w:r>
-      <w:r>
-        <w:t>entre</w:t>
-      </w:r>
-      <w:r>
-        <w:rPr>
-          <w:spacing w:val="-3"/>
-        </w:rPr>
-        <w:t xml:space="preserve"> </w:t>
-      </w:r>
-      <w:r>
-        <w:t>la</w:t>
-      </w:r>
-      <w:r>
-        <w:rPr>
-          <w:spacing w:val="-3"/>
-        </w:rPr>
-        <w:t xml:space="preserve"> </w:t>
-      </w:r>
-      <w:r>
-        <w:t xml:space="preserve">partie </w:t>
-      </w:r>
-      <w:proofErr w:type="spellStart"/>
-      <w:r>
-        <w:rPr>
-          <w:color w:val="1F1F1F"/>
-        </w:rPr>
-        <w:t>ChatBot</w:t>
-      </w:r>
-      <w:proofErr w:type="spellEnd"/>
-      <w:r>
-        <w:rPr>
-          <w:color w:val="1F1F1F"/>
-          <w:spacing w:val="-2"/>
-        </w:rPr>
-        <w:t xml:space="preserve"> </w:t>
-      </w:r>
-      <w:r>
-        <w:t>et</w:t>
-      </w:r>
-      <w:r>
-        <w:rPr>
-          <w:spacing w:val="-1"/>
-        </w:rPr>
-        <w:t xml:space="preserve"> </w:t>
-      </w:r>
-      <w:r>
-        <w:t>la</w:t>
-      </w:r>
-      <w:r>
-        <w:rPr>
-          <w:spacing w:val="-3"/>
-        </w:rPr>
-        <w:t xml:space="preserve"> </w:t>
-      </w:r>
-      <w:r>
-        <w:t>partie</w:t>
-      </w:r>
-      <w:r>
-        <w:rPr>
-          <w:spacing w:val="-1"/>
-        </w:rPr>
-        <w:t xml:space="preserve"> </w:t>
-      </w:r>
-      <w:proofErr w:type="spellStart"/>
-      <w:r>
-        <w:rPr>
-          <w:color w:val="1F1F1F"/>
-        </w:rPr>
-        <w:t>CVTech</w:t>
-      </w:r>
-      <w:proofErr w:type="spellEnd"/>
-      <w:r>
-        <w:t>, pour pouvoir intégrer les compétences collaborateurs.</w:t>
-      </w:r>
-    </w:p>
-    <w:p>
-      <w:pPr>
-        <w:pStyle w:val="Corpsdetexte"/>
-        <w:spacing w:line="259" w:lineRule="auto"/>
         <w:sectPr>
           <w:pgSz w:w="11920" w:h="16840"/>
           <w:pgMar w:top="1000" w:right="1275" w:bottom="1000" w:left="1417" w:header="770" w:footer="814" w:gutter="0"/>
           <w:cols w:space="720"/>
         </w:sectPr>
       </w:pPr>
-    </w:p>
-    <w:p>
-      <w:pPr>
-        <w:pStyle w:val="Corpsdetexte"/>
-        <w:spacing w:before="117"/>
-      </w:pPr>
-    </w:p>
-    <w:p>
-      <w:pPr>
-        <w:pStyle w:val="Corpsdetexte"/>
-        <w:ind w:left="9"/>
-      </w:pPr>
-      <w:r>
-        <w:rPr>
-          <w:color w:val="1F1F1F"/>
-        </w:rPr>
-        <w:t>Déroulement</w:t>
-      </w:r>
-      <w:r>
-        <w:rPr>
-          <w:color w:val="1F1F1F"/>
-          <w:spacing w:val="-14"/>
-        </w:rPr>
-        <w:t xml:space="preserve"> </w:t>
-      </w:r>
-      <w:r>
-        <w:rPr>
-          <w:color w:val="1F1F1F"/>
-          <w:spacing w:val="-10"/>
-        </w:rPr>
-        <w:t>:</w:t>
+      <w:r>
+        <w:t>Dans</w:t>
+      </w:r>
+      <w:r>
+        <w:rPr>
+          <w:spacing w:val="-3"/>
+        </w:rPr>
+        <w:t xml:space="preserve"> </w:t>
+      </w:r>
+      <w:r>
+        <w:t>le</w:t>
+      </w:r>
+      <w:r>
+        <w:rPr>
+          <w:spacing w:val="-3"/>
+        </w:rPr>
+        <w:t xml:space="preserve"> </w:t>
+      </w:r>
+      <w:r>
+        <w:t>cadre</w:t>
+      </w:r>
+      <w:r>
+        <w:rPr>
+          <w:spacing w:val="-3"/>
+        </w:rPr>
+        <w:t xml:space="preserve"> </w:t>
+      </w:r>
+      <w:r>
+        <w:t>de</w:t>
+      </w:r>
+      <w:r>
+        <w:rPr>
+          <w:spacing w:val="-3"/>
+        </w:rPr>
+        <w:t xml:space="preserve"> </w:t>
+      </w:r>
+      <w:r>
+        <w:t>la</w:t>
+      </w:r>
+      <w:r>
+        <w:rPr>
+          <w:spacing w:val="-1"/>
+        </w:rPr>
+        <w:t xml:space="preserve"> </w:t>
+      </w:r>
+      <w:r>
+        <w:t>mission</w:t>
+      </w:r>
+      <w:r>
+        <w:rPr>
+          <w:spacing w:val="-3"/>
+        </w:rPr>
+        <w:t xml:space="preserve"> </w:t>
+      </w:r>
+      <w:r>
+        <w:t>j</w:t>
+      </w:r>
+      <w:r>
+        <w:t xml:space="preserve">’ai </w:t>
+      </w:r>
+      <w:r>
+        <w:t>pu</w:t>
+      </w:r>
+      <w:r>
+        <w:t xml:space="preserve"> découvrir et effectuer toutes les différentes parties de la conception de l’application</w:t>
       </w:r>
     </w:p>
     <w:p>
@@ -10461,54 +9834,14 @@
           <w:sz w:val="20"/>
         </w:rPr>
       </w:pPr>
-      <w:r>
-        <w:rPr>
-          <w:noProof/>
-          <w:sz w:val="20"/>
-        </w:rPr>
-        <w:drawing>
-          <wp:anchor distT="0" distB="0" distL="0" distR="0" simplePos="0" relativeHeight="487591936" behindDoc="1" locked="0" layoutInCell="1" allowOverlap="1" wp14:anchorId="2DE22323" wp14:editId="576ACFA1">
-            <wp:simplePos x="0" y="0"/>
-            <wp:positionH relativeFrom="page">
-              <wp:posOffset>949452</wp:posOffset>
-            </wp:positionH>
-            <wp:positionV relativeFrom="paragraph">
-              <wp:posOffset>206667</wp:posOffset>
-            </wp:positionV>
-            <wp:extent cx="5707835" cy="3200400"/>
-            <wp:effectExtent l="0" t="0" r="0" b="0"/>
-            <wp:wrapTopAndBottom/>
-            <wp:docPr id="23" name="Image 23"/>
-            <wp:cNvGraphicFramePr>
-              <a:graphicFrameLocks xmlns:a="http://schemas.openxmlformats.org/drawingml/2006/main"/>
-            </wp:cNvGraphicFramePr>
-            <a:graphic xmlns:a="http://schemas.openxmlformats.org/drawingml/2006/main">
-              <a:graphicData uri="http://schemas.openxmlformats.org/drawingml/2006/picture">
-                <pic:pic xmlns:pic="http://schemas.openxmlformats.org/drawingml/2006/picture">
-                  <pic:nvPicPr>
-                    <pic:cNvPr id="23" name="Image 23"/>
-                    <pic:cNvPicPr/>
-                  </pic:nvPicPr>
-                  <pic:blipFill>
-                    <a:blip r:embed="rId17" cstate="print"/>
-                    <a:stretch>
-                      <a:fillRect/>
-                    </a:stretch>
-                  </pic:blipFill>
-                  <pic:spPr>
-                    <a:xfrm>
-                      <a:off x="0" y="0"/>
-                      <a:ext cx="5707835" cy="3200400"/>
-                    </a:xfrm>
-                    <a:prstGeom prst="rect">
-                      <a:avLst/>
-                    </a:prstGeom>
-                  </pic:spPr>
-                </pic:pic>
-              </a:graphicData>
-            </a:graphic>
-          </wp:anchor>
-        </w:drawing>
+    </w:p>
+    <w:p>
+      <w:pPr>
+        <w:pStyle w:val="Corpsdetexte"/>
+        <w:spacing w:before="56"/>
+      </w:pPr>
+      <w:r>
+        <w:t xml:space="preserve">Etapes de conception de l’application : </w:t>
       </w:r>
     </w:p>
     <w:p>
@@ -10592,306 +9925,133 @@
         <w:rPr>
           <w:color w:val="1F1F1F"/>
         </w:rPr>
-        <w:t>extraire</w:t>
-      </w:r>
-      <w:r>
-        <w:rPr>
-          <w:color w:val="1F1F1F"/>
-          <w:spacing w:val="-16"/>
-        </w:rPr>
-        <w:t xml:space="preserve"> </w:t>
-      </w:r>
-      <w:r>
-        <w:rPr>
-          <w:color w:val="1F1F1F"/>
-        </w:rPr>
-        <w:t>les</w:t>
-      </w:r>
-      <w:r>
-        <w:rPr>
-          <w:color w:val="1F1F1F"/>
-          <w:spacing w:val="-16"/>
-        </w:rPr>
-        <w:t xml:space="preserve"> </w:t>
-      </w:r>
-      <w:r>
-        <w:rPr>
-          <w:color w:val="1F1F1F"/>
-        </w:rPr>
-        <w:t>données</w:t>
-      </w:r>
-      <w:r>
-        <w:rPr>
-          <w:color w:val="1F1F1F"/>
-          <w:spacing w:val="-15"/>
-        </w:rPr>
-        <w:t xml:space="preserve"> </w:t>
-      </w:r>
-      <w:r>
-        <w:rPr>
-          <w:color w:val="1F1F1F"/>
-        </w:rPr>
-        <w:t>issues</w:t>
-      </w:r>
-      <w:r>
-        <w:rPr>
-          <w:color w:val="1F1F1F"/>
-          <w:spacing w:val="-16"/>
-        </w:rPr>
-        <w:t xml:space="preserve"> </w:t>
-      </w:r>
-      <w:r>
-        <w:rPr>
-          <w:color w:val="1F1F1F"/>
-        </w:rPr>
-        <w:t>de</w:t>
-      </w:r>
-      <w:r>
-        <w:rPr>
-          <w:color w:val="1F1F1F"/>
-          <w:spacing w:val="-17"/>
-        </w:rPr>
-        <w:t xml:space="preserve"> </w:t>
-      </w:r>
-      <w:r>
-        <w:rPr>
-          <w:color w:val="1F1F1F"/>
-        </w:rPr>
-        <w:t>chaque</w:t>
-      </w:r>
-      <w:r>
-        <w:rPr>
-          <w:color w:val="1F1F1F"/>
-          <w:spacing w:val="-15"/>
-        </w:rPr>
-        <w:t xml:space="preserve"> </w:t>
-      </w:r>
-      <w:r>
-        <w:rPr>
-          <w:color w:val="1F1F1F"/>
-        </w:rPr>
-        <w:t>Matrice</w:t>
-      </w:r>
-      <w:r>
-        <w:rPr>
-          <w:color w:val="1F1F1F"/>
-          <w:spacing w:val="-16"/>
-        </w:rPr>
-        <w:t xml:space="preserve"> </w:t>
-      </w:r>
-      <w:r>
-        <w:rPr>
-          <w:color w:val="1F1F1F"/>
-        </w:rPr>
-        <w:t>de</w:t>
-      </w:r>
-      <w:r>
-        <w:rPr>
-          <w:color w:val="1F1F1F"/>
-          <w:spacing w:val="-15"/>
-        </w:rPr>
-        <w:t xml:space="preserve"> </w:t>
-      </w:r>
-      <w:r>
-        <w:rPr>
-          <w:color w:val="1F1F1F"/>
-        </w:rPr>
-        <w:t>Compétences pour chaque collaborateur, ces dernières étant sous format Excel.</w:t>
-      </w:r>
-    </w:p>
-    <w:p>
-      <w:pPr>
-        <w:pStyle w:val="Corpsdetexte"/>
-        <w:spacing w:before="9" w:line="259" w:lineRule="auto"/>
-        <w:ind w:left="18" w:right="140" w:hanging="10"/>
-      </w:pPr>
-      <w:r>
-        <w:rPr>
-          <w:color w:val="1F1F1F"/>
-        </w:rPr>
-        <w:t>Ensuite, il a fallu que je les Parse en prenant toutes les informations issues des fichiers et les insérer dans une base de données.</w:t>
-      </w:r>
-    </w:p>
-    <w:p>
-      <w:pPr>
-        <w:pStyle w:val="Corpsdetexte"/>
-        <w:spacing w:before="1"/>
-      </w:pPr>
+        <w:t xml:space="preserve">chercher les différentes API </w:t>
+      </w:r>
+      <w:r>
+        <w:rPr>
+          <w:color w:val="1F1F1F"/>
+        </w:rPr>
+        <w:t xml:space="preserve">correspondantes aux données recherchées comme les données liées à l’inflation, aux matières premières ou encore au cinéma. Puis après avoir évalué la pertinence des données vis-à-vis du besoin du projet et au niveau du client, on prend le lien de l’API et on effectue des tests de requête via Postman. Suite à ces différents tests, on créer un script Python </w:t>
+      </w:r>
+      <w:r>
+        <w:rPr>
+          <w:color w:val="1F1F1F"/>
+        </w:rPr>
+        <w:t>pouvant récupérer</w:t>
+      </w:r>
+      <w:r>
+        <w:rPr>
+          <w:color w:val="1F1F1F"/>
+        </w:rPr>
+        <w:t xml:space="preserve"> les données </w:t>
+      </w:r>
+      <w:r>
+        <w:rPr>
+          <w:color w:val="1F1F1F"/>
+        </w:rPr>
+        <w:t xml:space="preserve">sous un format </w:t>
+      </w:r>
+      <w:r>
+        <w:rPr>
+          <w:color w:val="1F1F1F"/>
+        </w:rPr>
+        <w:t>JSON</w:t>
+      </w:r>
+      <w:r>
+        <w:rPr>
+          <w:color w:val="1F1F1F"/>
+        </w:rPr>
+        <w:t xml:space="preserve"> et en prenant une structure de dossiers correcte pour la mise sur Google Cloud Plateform</w:t>
+      </w:r>
+      <w:r>
+        <w:rPr>
+          <w:color w:val="1F1F1F"/>
+        </w:rPr>
+        <w:t xml:space="preserve"> (</w:t>
+      </w:r>
+      <w:r>
+        <w:t>GCP</w:t>
+      </w:r>
+      <w:r>
+        <w:t>)</w:t>
+      </w:r>
+      <w:r>
+        <w:rPr>
+          <w:color w:val="1F1F1F"/>
+        </w:rPr>
+        <w:t>.</w:t>
+      </w:r>
     </w:p>
     <w:p>
       <w:pPr>
         <w:pStyle w:val="Corpsdetexte"/>
         <w:spacing w:line="261" w:lineRule="auto"/>
-        <w:ind w:left="33" w:right="140" w:hanging="10"/>
-      </w:pPr>
-      <w:r>
-        <w:rPr>
-          <w:color w:val="1F1F1F"/>
-        </w:rPr>
-        <w:t>J’ai</w:t>
-      </w:r>
-      <w:r>
-        <w:rPr>
-          <w:color w:val="1F1F1F"/>
-          <w:spacing w:val="40"/>
-        </w:rPr>
-        <w:t xml:space="preserve"> </w:t>
-      </w:r>
-      <w:r>
-        <w:rPr>
-          <w:color w:val="1F1F1F"/>
-        </w:rPr>
-        <w:t>choisi</w:t>
-      </w:r>
-      <w:r>
-        <w:rPr>
-          <w:color w:val="1F1F1F"/>
-          <w:spacing w:val="40"/>
-        </w:rPr>
-        <w:t xml:space="preserve"> </w:t>
-      </w:r>
-      <w:r>
-        <w:rPr>
-          <w:color w:val="1F1F1F"/>
-        </w:rPr>
-        <w:t>de</w:t>
-      </w:r>
-      <w:r>
-        <w:rPr>
-          <w:color w:val="1F1F1F"/>
-          <w:spacing w:val="40"/>
-        </w:rPr>
-        <w:t xml:space="preserve"> </w:t>
-      </w:r>
-      <w:r>
-        <w:rPr>
-          <w:color w:val="1F1F1F"/>
-        </w:rPr>
-        <w:t>partir</w:t>
-      </w:r>
-      <w:r>
-        <w:rPr>
-          <w:color w:val="1F1F1F"/>
-          <w:spacing w:val="40"/>
-        </w:rPr>
-        <w:t xml:space="preserve"> </w:t>
-      </w:r>
-      <w:r>
-        <w:rPr>
-          <w:color w:val="1F1F1F"/>
-        </w:rPr>
-        <w:t>sur</w:t>
-      </w:r>
-      <w:r>
-        <w:rPr>
-          <w:color w:val="1F1F1F"/>
-          <w:spacing w:val="40"/>
-        </w:rPr>
-        <w:t xml:space="preserve"> </w:t>
-      </w:r>
-      <w:r>
-        <w:rPr>
-          <w:color w:val="1F1F1F"/>
-        </w:rPr>
-        <w:t>une</w:t>
-      </w:r>
-      <w:r>
-        <w:rPr>
-          <w:color w:val="1F1F1F"/>
-          <w:spacing w:val="40"/>
-        </w:rPr>
-        <w:t xml:space="preserve"> </w:t>
-      </w:r>
-      <w:r>
-        <w:rPr>
-          <w:color w:val="1F1F1F"/>
-        </w:rPr>
-        <w:t>BDD</w:t>
-      </w:r>
-      <w:r>
-        <w:rPr>
-          <w:color w:val="1F1F1F"/>
-          <w:spacing w:val="40"/>
-        </w:rPr>
-        <w:t xml:space="preserve"> </w:t>
-      </w:r>
-      <w:r>
-        <w:rPr>
-          <w:color w:val="1F1F1F"/>
-        </w:rPr>
-        <w:t>MYSQL</w:t>
-      </w:r>
-      <w:r>
-        <w:rPr>
-          <w:color w:val="1F1F1F"/>
-          <w:spacing w:val="40"/>
-        </w:rPr>
-        <w:t xml:space="preserve"> </w:t>
-      </w:r>
-      <w:r>
-        <w:rPr>
-          <w:color w:val="1F1F1F"/>
-        </w:rPr>
-        <w:t>pour</w:t>
-      </w:r>
-      <w:r>
-        <w:rPr>
-          <w:color w:val="1F1F1F"/>
-          <w:spacing w:val="40"/>
-        </w:rPr>
-        <w:t xml:space="preserve"> </w:t>
-      </w:r>
-      <w:r>
-        <w:rPr>
-          <w:color w:val="1F1F1F"/>
-        </w:rPr>
-        <w:t>Lire/Ecrire</w:t>
-      </w:r>
-      <w:r>
-        <w:rPr>
-          <w:color w:val="1F1F1F"/>
-          <w:spacing w:val="40"/>
-        </w:rPr>
-        <w:t xml:space="preserve"> </w:t>
-      </w:r>
-      <w:r>
-        <w:rPr>
-          <w:color w:val="1F1F1F"/>
-        </w:rPr>
-        <w:t>les</w:t>
-      </w:r>
-      <w:r>
-        <w:rPr>
-          <w:color w:val="1F1F1F"/>
-          <w:spacing w:val="40"/>
-        </w:rPr>
-        <w:t xml:space="preserve"> </w:t>
-      </w:r>
-      <w:r>
-        <w:rPr>
-          <w:color w:val="1F1F1F"/>
-        </w:rPr>
-        <w:t>informations</w:t>
-      </w:r>
-      <w:r>
-        <w:rPr>
-          <w:color w:val="1F1F1F"/>
-          <w:spacing w:val="40"/>
-        </w:rPr>
-        <w:t xml:space="preserve"> </w:t>
-      </w:r>
-      <w:r>
-        <w:rPr>
-          <w:color w:val="1F1F1F"/>
-        </w:rPr>
-        <w:t xml:space="preserve">des </w:t>
-      </w:r>
-      <w:r>
-        <w:rPr>
-          <w:color w:val="1F1F1F"/>
-          <w:spacing w:val="-2"/>
-        </w:rPr>
-        <w:t>matrices.</w:t>
+      </w:pPr>
+    </w:p>
+    <w:p>
+      <w:pPr>
+        <w:pStyle w:val="Corpsdetexte"/>
+        <w:spacing w:line="261" w:lineRule="auto"/>
+      </w:pPr>
+      <w:r>
+        <w:t>Après avoir réussi à obtenir les données sous le bon format et avec aucune erreur ou problème au niveau de la récupération, on adapte le code originaire du local vers GCP</w:t>
+      </w:r>
+      <w:r>
+        <w:t xml:space="preserve">, en </w:t>
+      </w:r>
+      <w:r>
+        <w:t>ajoutant les</w:t>
+      </w:r>
+      <w:r>
+        <w:t xml:space="preserve"> dossiers du Bucket  et la </w:t>
+      </w:r>
+      <w:r>
+        <w:t>bibliothèque Python</w:t>
+      </w:r>
+      <w:r>
+        <w:t xml:space="preserve"> google.cloud</w:t>
+      </w:r>
+    </w:p>
+    <w:p>
+      <w:pPr>
+        <w:pStyle w:val="Corpsdetexte"/>
+        <w:spacing w:line="261" w:lineRule="auto"/>
+      </w:pPr>
+    </w:p>
+    <w:p>
+      <w:pPr>
+        <w:pStyle w:val="Corpsdetexte"/>
+        <w:spacing w:line="261" w:lineRule="auto"/>
+      </w:pPr>
+    </w:p>
+    <w:p>
+      <w:pPr>
+        <w:pStyle w:val="Corpsdetexte"/>
+        <w:spacing w:line="261" w:lineRule="auto"/>
+      </w:pPr>
+    </w:p>
+    <w:p>
+      <w:pPr>
+        <w:pStyle w:val="Corpsdetexte"/>
+        <w:spacing w:line="261" w:lineRule="auto"/>
+      </w:pPr>
+      <w:r>
+        <w:t>**Mettre une capture de google cloud**</w:t>
+      </w:r>
+    </w:p>
+    <w:p>
+      <w:pPr>
+        <w:pStyle w:val="Corpsdetexte"/>
+        <w:spacing w:line="261" w:lineRule="auto"/>
+      </w:pPr>
+    </w:p>
+    <w:p>
+      <w:pPr>
+        <w:pStyle w:val="Corpsdetexte"/>
+        <w:spacing w:line="261" w:lineRule="auto"/>
+      </w:pPr>
+      <w:r>
+        <w:t>On mettra sur Git</w:t>
       </w:r>
     </w:p>
     <w:p>
@@ -10904,6 +10064,61 @@
           <w:cols w:space="720"/>
         </w:sectPr>
       </w:pPr>
+      <w:r>
+        <w:t xml:space="preserve">En le mettant sur </w:t>
+      </w:r>
+      <w:r>
+        <w:t>GCP, le</w:t>
+      </w:r>
+      <w:r>
+        <w:t xml:space="preserve"> code sera </w:t>
+      </w:r>
+      <w:r>
+        <w:t>mis</w:t>
+      </w:r>
+      <w:r>
+        <w:t xml:space="preserve"> dans un job qui sera exécut</w:t>
+      </w:r>
+      <w:r>
+        <w:t>é</w:t>
+      </w:r>
+      <w:r>
+        <w:t xml:space="preserve"> un nombre de fois défini à la manière d’un cron, suite à ça, </w:t>
+      </w:r>
+      <w:r>
+        <w:t xml:space="preserve">dans ce job, </w:t>
+      </w:r>
+      <w:r>
+        <w:t xml:space="preserve">on créera un swagger </w:t>
+      </w:r>
+      <w:r>
+        <w:t>permettant d’interroger l’API afin d’obtenir les données voulues</w:t>
+      </w:r>
+      <w:r>
+        <w:t>, les données voulues seront prises en fonction du moment, comme une date, une période ou même en temps réel.</w:t>
+      </w:r>
+      <w:r>
+        <w:t xml:space="preserve"> Pour vérifier le résultat du swagger, </w:t>
+      </w:r>
+      <w:r>
+        <w:t xml:space="preserve">on </w:t>
+      </w:r>
+      <w:r>
+        <w:t>déplo</w:t>
+      </w:r>
+      <w:r>
+        <w:rPr>
+          <w:b/>
+          <w:bCs/>
+        </w:rPr>
+        <w:t>iera</w:t>
+      </w:r>
+      <w:r>
+        <w:t xml:space="preserve"> </w:t>
+      </w:r>
+      <w:r>
+        <w:t xml:space="preserve"> un premier service qui sera d’abord un swagger </w:t>
+      </w:r>
     </w:p>
     <w:p>
       <w:pPr>
@@ -11053,7 +10268,7 @@
                     <pic:cNvPicPr/>
                   </pic:nvPicPr>
                   <pic:blipFill>
-                    <a:blip r:embed="rId18" cstate="print"/>
+                    <a:blip r:embed="rId17" cstate="print"/>
                     <a:stretch>
                       <a:fillRect/>
                     </a:stretch>
@@ -11177,21 +10392,7 @@
         <w:rPr>
           <w:color w:val="1F1F1F"/>
         </w:rPr>
-        <w:t xml:space="preserve">durant ce stage, il s’agit d’un </w:t>
-      </w:r>
-      <w:proofErr w:type="spellStart"/>
-      <w:r>
-        <w:rPr>
-          <w:color w:val="1F1F1F"/>
-        </w:rPr>
-        <w:t>framework</w:t>
-      </w:r>
-      <w:proofErr w:type="spellEnd"/>
-      <w:r>
-        <w:rPr>
-          <w:color w:val="1F1F1F"/>
-        </w:rPr>
-        <w:t xml:space="preserve"> Python, utilisé pour créer des pages web.</w:t>
+        <w:t>durant ce stage, il s’agit d’un framework Python, utilisé pour créer des pages web.</w:t>
       </w:r>
     </w:p>
     <w:p>
@@ -11211,21 +10412,7 @@
         <w:rPr>
           <w:color w:val="1F1F1F"/>
         </w:rPr>
-        <w:t xml:space="preserve">La partie </w:t>
-      </w:r>
-      <w:proofErr w:type="spellStart"/>
-      <w:r>
-        <w:rPr>
-          <w:color w:val="1F1F1F"/>
-        </w:rPr>
-        <w:t>front-end</w:t>
-      </w:r>
-      <w:proofErr w:type="spellEnd"/>
-      <w:r>
-        <w:rPr>
-          <w:color w:val="1F1F1F"/>
-        </w:rPr>
-        <w:t>, j’ai utilisé les langages que sont le HTML et CSS afin d’avoir une interface nette avec un affichage correct.</w:t>
+        <w:t>La partie front-end, j’ai utilisé les langages que sont le HTML et CSS afin d’avoir une interface nette avec un affichage correct.</w:t>
       </w:r>
     </w:p>
     <w:p>
@@ -11245,21 +10432,7 @@
         <w:rPr>
           <w:color w:val="1F1F1F"/>
         </w:rPr>
-        <w:t xml:space="preserve">Pour la partie </w:t>
-      </w:r>
-      <w:proofErr w:type="spellStart"/>
-      <w:r>
-        <w:rPr>
-          <w:color w:val="1F1F1F"/>
-        </w:rPr>
-        <w:t>back-end</w:t>
-      </w:r>
-      <w:proofErr w:type="spellEnd"/>
-      <w:r>
-        <w:rPr>
-          <w:color w:val="1F1F1F"/>
-        </w:rPr>
-        <w:t>, je me suis servi de Flask soit de Python afin de pouvoir gérer le traitement des données et gérer les fonctionnalités de l’application</w:t>
+        <w:t>Pour la partie back-end, je me suis servi de Flask soit de Python afin de pouvoir gérer le traitement des données et gérer les fonctionnalités de l’application</w:t>
       </w:r>
     </w:p>
     <w:p>
@@ -11369,7 +10542,7 @@
                     <pic:cNvPicPr/>
                   </pic:nvPicPr>
                   <pic:blipFill>
-                    <a:blip r:embed="rId19" cstate="print"/>
+                    <a:blip r:embed="rId18" cstate="print"/>
                     <a:stretch>
                       <a:fillRect/>
                     </a:stretch>
@@ -11524,14 +10697,12 @@
         </w:rPr>
         <w:t xml:space="preserve"> </w:t>
       </w:r>
-      <w:proofErr w:type="spellStart"/>
       <w:r>
         <w:rPr>
           <w:color w:val="1F1F1F"/>
         </w:rPr>
         <w:t>ChatBot</w:t>
       </w:r>
-      <w:proofErr w:type="spellEnd"/>
       <w:r>
         <w:rPr>
           <w:color w:val="1F1F1F"/>
@@ -11621,21 +10792,7 @@
         <w:rPr>
           <w:color w:val="1F1F1F"/>
         </w:rPr>
-        <w:t xml:space="preserve">lier ce que nous avons fait à la </w:t>
-      </w:r>
-      <w:proofErr w:type="spellStart"/>
-      <w:r>
-        <w:rPr>
-          <w:color w:val="1F1F1F"/>
-        </w:rPr>
-        <w:t>CVTech</w:t>
-      </w:r>
-      <w:proofErr w:type="spellEnd"/>
-      <w:r>
-        <w:rPr>
-          <w:color w:val="1F1F1F"/>
-        </w:rPr>
-        <w:t>.</w:t>
+        <w:t>lier ce que nous avons fait à la CVTech.</w:t>
       </w:r>
     </w:p>
     <w:p>
@@ -11852,19 +11009,11 @@
         </w:rPr>
         <w:t xml:space="preserve"> </w:t>
       </w:r>
-      <w:proofErr w:type="spellStart"/>
-      <w:r>
-        <w:rPr>
-          <w:color w:val="1F1F1F"/>
-        </w:rPr>
-        <w:t>ChatBot</w:t>
-      </w:r>
-      <w:proofErr w:type="spellEnd"/>
-      <w:r>
-        <w:rPr>
-          <w:color w:val="1F1F1F"/>
-        </w:rPr>
-        <w:t xml:space="preserve"> avec les données de ma base.</w:t>
+      <w:r>
+        <w:rPr>
+          <w:color w:val="1F1F1F"/>
+        </w:rPr>
+        <w:t>ChatBot avec les données de ma base.</w:t>
       </w:r>
     </w:p>
     <w:p>
@@ -12006,7 +11155,7 @@
                     <pic:cNvPicPr/>
                   </pic:nvPicPr>
                   <pic:blipFill>
-                    <a:blip r:embed="rId20" cstate="print"/>
+                    <a:blip r:embed="rId19" cstate="print"/>
                     <a:stretch>
                       <a:fillRect/>
                     </a:stretch>
@@ -12347,11 +11496,9 @@
         </w:rPr>
         <w:t xml:space="preserve"> </w:t>
       </w:r>
-      <w:proofErr w:type="spellStart"/>
       <w:r>
         <w:t>ChatBot</w:t>
       </w:r>
-      <w:proofErr w:type="spellEnd"/>
       <w:r>
         <w:rPr>
           <w:spacing w:val="-3"/>
@@ -12422,15 +11569,7 @@
         <w:t xml:space="preserve"> </w:t>
       </w:r>
       <w:r>
-        <w:t xml:space="preserve">structure de données de mon autre collègue qui avait la charge de la </w:t>
-      </w:r>
-      <w:proofErr w:type="spellStart"/>
-      <w:r>
-        <w:t>CVTech</w:t>
-      </w:r>
-      <w:proofErr w:type="spellEnd"/>
-      <w:r>
-        <w:t>.</w:t>
+        <w:t>structure de données de mon autre collègue qui avait la charge de la CVTech.</w:t>
       </w:r>
     </w:p>
     <w:p>
@@ -12554,15 +11693,7 @@
         <w:t xml:space="preserve"> </w:t>
       </w:r>
       <w:r>
-        <w:t xml:space="preserve">à mes collègues, comment déployer un service informatique pour des utilisateurs via Google Cloud </w:t>
-      </w:r>
-      <w:proofErr w:type="spellStart"/>
-      <w:r>
-        <w:t>Plateform</w:t>
-      </w:r>
-      <w:proofErr w:type="spellEnd"/>
-      <w:r>
-        <w:t xml:space="preserve"> (GCP).</w:t>
+        <w:t>à mes collègues, comment déployer un service informatique pour des utilisateurs via Google Cloud Plateform (GCP).</w:t>
       </w:r>
     </w:p>
     <w:p>
@@ -12843,11 +11974,9 @@
         </w:rPr>
         <w:t xml:space="preserve"> </w:t>
       </w:r>
-      <w:proofErr w:type="spellStart"/>
       <w:r>
         <w:t>frameworks</w:t>
       </w:r>
-      <w:proofErr w:type="spellEnd"/>
       <w:r>
         <w:rPr>
           <w:spacing w:val="-6"/>
@@ -12881,19 +12010,11 @@
         </w:rPr>
         <w:t xml:space="preserve"> </w:t>
       </w:r>
-      <w:proofErr w:type="spellStart"/>
       <w:r>
         <w:rPr>
           <w:spacing w:val="-2"/>
         </w:rPr>
-        <w:t>Streamlit</w:t>
-      </w:r>
-      <w:proofErr w:type="spellEnd"/>
-      <w:r>
-        <w:rPr>
-          <w:spacing w:val="-2"/>
-        </w:rPr>
-        <w:t>.</w:t>
+        <w:t>Streamlit.</w:t>
       </w:r>
     </w:p>
     <w:p>
@@ -13020,15 +12141,7 @@
         <w:t xml:space="preserve"> </w:t>
       </w:r>
       <w:r>
-        <w:t xml:space="preserve">du développement comme la data avec l’existence de </w:t>
-      </w:r>
-      <w:proofErr w:type="spellStart"/>
-      <w:r>
-        <w:t>Snowflake</w:t>
-      </w:r>
-      <w:proofErr w:type="spellEnd"/>
-      <w:r>
-        <w:t xml:space="preserve"> et de son mode de </w:t>
+        <w:t xml:space="preserve">du développement comme la data avec l’existence de Snowflake et de son mode de </w:t>
       </w:r>
       <w:r>
         <w:rPr>
@@ -13782,23 +12895,7 @@
         <w:ind w:left="33" w:right="415" w:hanging="10"/>
       </w:pPr>
       <w:r>
-        <w:t xml:space="preserve">J'ai surtout découvert le </w:t>
-      </w:r>
-      <w:proofErr w:type="spellStart"/>
-      <w:r>
-        <w:t>framework</w:t>
-      </w:r>
-      <w:proofErr w:type="spellEnd"/>
-      <w:r>
-        <w:t xml:space="preserve"> Python Flask et en général l'existence et l'utilisation de </w:t>
-      </w:r>
-      <w:proofErr w:type="spellStart"/>
-      <w:r>
-        <w:t>framework</w:t>
-      </w:r>
-      <w:proofErr w:type="spellEnd"/>
-      <w:r>
-        <w:t xml:space="preserve"> dans l'univers du développement comme Vue.js pour le web,</w:t>
+        <w:t>J'ai surtout découvert le framework Python Flask et en général l'existence et l'utilisation de framework dans l'univers du développement comme Vue.js pour le web,</w:t>
       </w:r>
       <w:r>
         <w:rPr>
@@ -13878,11 +12975,9 @@
         </w:rPr>
         <w:t xml:space="preserve"> </w:t>
       </w:r>
-      <w:proofErr w:type="spellStart"/>
       <w:r>
         <w:t>Plateform</w:t>
       </w:r>
-      <w:proofErr w:type="spellEnd"/>
       <w:r>
         <w:rPr>
           <w:spacing w:val="-6"/>
@@ -13962,11 +13057,9 @@
         </w:rPr>
         <w:t xml:space="preserve"> </w:t>
       </w:r>
-      <w:proofErr w:type="spellStart"/>
       <w:r>
         <w:t>chatbot</w:t>
       </w:r>
-      <w:proofErr w:type="spellEnd"/>
       <w:r>
         <w:rPr>
           <w:spacing w:val="-5"/>
@@ -14732,7 +13825,7 @@
 </file>
 
 <file path=word/endnotes.xml><?xml version="1.0" encoding="utf-8"?>
-<w:endnotes xmlns:wpc="http://schemas.microsoft.com/office/word/2010/wordprocessingCanvas" xmlns:cx="http://schemas.microsoft.com/office/drawing/2014/chartex" xmlns:cx1="http://schemas.microsoft.com/office/drawing/2015/9/8/chartex" xmlns:cx2="http://schemas.microsoft.com/office/drawing/2015/10/21/chartex" xmlns:cx3="http://schemas.microsoft.com/office/drawing/2016/5/9/chartex" xmlns:cx4="http://schemas.microsoft.com/office/drawing/2016/5/10/chartex" xmlns:cx5="http://schemas.microsoft.com/office/drawing/2016/5/11/chartex" xmlns:cx6="http://schemas.microsoft.com/office/drawing/2016/5/12/chartex" xmlns:cx7="http://schemas.microsoft.com/office/drawing/2016/5/13/chartex" xmlns:cx8="http://schemas.microsoft.com/office/drawing/2016/5/14/chartex" xmlns:mc="http://schemas.openxmlformats.org/markup-compatibility/2006" xmlns:aink="http://schemas.microsoft.com/office/drawing/2016/ink" xmlns:am3d="http://schemas.microsoft.com/office/drawing/2017/model3d" xmlns:o="urn:schemas-microsoft-com:office:office" xmlns:oel="http://schemas.microsoft.com/office/2019/extlst" xmlns:r="http://schemas.openxmlformats.org/officeDocument/2006/relationships" xmlns:m="http://schemas.openxmlformats.org/officeDocument/2006/math" xmlns:v="urn:schemas-microsoft-com:vml" xmlns:wp14="http://schemas.microsoft.com/office/word/2010/wordprocessingDrawing" xmlns:wp="http://schemas.openxmlformats.org/drawingml/2006/wordprocessingDrawing" xmlns:w10="urn:schemas-microsoft-com:office:word" xmlns:w="http://schemas.openxmlformats.org/wordprocessingml/2006/main" xmlns:w14="http://schemas.microsoft.com/office/word/2010/wordml" xmlns:w15="http://schemas.microsoft.com/office/word/2012/wordml" xmlns:w16cex="http://schemas.microsoft.com/office/word/2018/wordml/cex" xmlns:w16cid="http://schemas.microsoft.com/office/word/2016/wordml/cid" xmlns:w16="http://schemas.microsoft.com/office/word/2018/wordml" xmlns:w16du="http://schemas.microsoft.com/office/word/2023/wordml/word16du" xmlns:w16sdtdh="http://schemas.microsoft.com/office/word/2020/wordml/sdtdatahash" xmlns:w16se="http://schemas.microsoft.com/office/word/2015/wordml/symex" xmlns:wpg="http://schemas.microsoft.com/office/word/2010/wordprocessingGroup" xmlns:wpi="http://schemas.microsoft.com/office/word/2010/wordprocessingInk" xmlns:wne="http://schemas.microsoft.com/office/word/2006/wordml" xmlns:wps="http://schemas.microsoft.com/office/word/2010/wordprocessingShape" mc:Ignorable="w14 w15 w16se w16cid w16 w16cex w16sdtdh w16du wp14">
+<w:endnotes xmlns:wpc="http://schemas.microsoft.com/office/word/2010/wordprocessingCanvas" xmlns:cx="http://schemas.microsoft.com/office/drawing/2014/chartex" xmlns:cx1="http://schemas.microsoft.com/office/drawing/2015/9/8/chartex" xmlns:cx2="http://schemas.microsoft.com/office/drawing/2015/10/21/chartex" xmlns:cx3="http://schemas.microsoft.com/office/drawing/2016/5/9/chartex" xmlns:cx4="http://schemas.microsoft.com/office/drawing/2016/5/10/chartex" xmlns:cx5="http://schemas.microsoft.com/office/drawing/2016/5/11/chartex" xmlns:cx6="http://schemas.microsoft.com/office/drawing/2016/5/12/chartex" xmlns:cx7="http://schemas.microsoft.com/office/drawing/2016/5/13/chartex" xmlns:cx8="http://schemas.microsoft.com/office/drawing/2016/5/14/chartex" xmlns:mc="http://schemas.openxmlformats.org/markup-compatibility/2006" xmlns:aink="http://schemas.microsoft.com/office/drawing/2016/ink" xmlns:am3d="http://schemas.microsoft.com/office/drawing/2017/model3d" xmlns:o="urn:schemas-microsoft-com:office:office" xmlns:oel="http://schemas.microsoft.com/office/2019/extlst" xmlns:r="http://schemas.openxmlformats.org/officeDocument/2006/relationships" xmlns:m="http://schemas.openxmlformats.org/officeDocument/2006/math" xmlns:v="urn:schemas-microsoft-com:vml" xmlns:wp14="http://schemas.microsoft.com/office/word/2010/wordprocessingDrawing" xmlns:wp="http://schemas.openxmlformats.org/drawingml/2006/wordprocessingDrawing" xmlns:w10="urn:schemas-microsoft-com:office:word" xmlns:w="http://schemas.openxmlformats.org/wordprocessingml/2006/main" xmlns:w14="http://schemas.microsoft.com/office/word/2010/wordml" xmlns:w15="http://schemas.microsoft.com/office/word/2012/wordml" xmlns:w16cex="http://schemas.microsoft.com/office/word/2018/wordml/cex" xmlns:w16cid="http://schemas.microsoft.com/office/word/2016/wordml/cid" xmlns:w16="http://schemas.microsoft.com/office/word/2018/wordml" xmlns:w16du="http://schemas.microsoft.com/office/word/2023/wordml/word16du" xmlns:w16sdtdh="http://schemas.microsoft.com/office/word/2020/wordml/sdtdatahash" xmlns:w16sdtfl="http://schemas.microsoft.com/office/word/2024/wordml/sdtformatlock" xmlns:w16se="http://schemas.microsoft.com/office/word/2015/wordml/symex" xmlns:wpg="http://schemas.microsoft.com/office/word/2010/wordprocessingGroup" xmlns:wpi="http://schemas.microsoft.com/office/word/2010/wordprocessingInk" xmlns:wne="http://schemas.microsoft.com/office/word/2006/wordml" xmlns:wps="http://schemas.microsoft.com/office/word/2010/wordprocessingShape" mc:Ignorable="w14 w15 w16se w16cid w16 w16cex w16sdtdh w16sdtfl w16du wp14">
   <w:endnote w:type="separator" w:id="-1">
     <w:p>
       <w:r>
@@ -14751,7 +13844,7 @@
 </file>
 
 <file path=word/footer1.xml><?xml version="1.0" encoding="utf-8"?>
-<w:ftr xmlns:wpc="http://schemas.microsoft.com/office/word/2010/wordprocessingCanvas" xmlns:cx="http://schemas.microsoft.com/office/drawing/2014/chartex" xmlns:cx1="http://schemas.microsoft.com/office/drawing/2015/9/8/chartex" xmlns:cx2="http://schemas.microsoft.com/office/drawing/2015/10/21/chartex" xmlns:cx3="http://schemas.microsoft.com/office/drawing/2016/5/9/chartex" xmlns:cx4="http://schemas.microsoft.com/office/drawing/2016/5/10/chartex" xmlns:cx5="http://schemas.microsoft.com/office/drawing/2016/5/11/chartex" xmlns:cx6="http://schemas.microsoft.com/office/drawing/2016/5/12/chartex" xmlns:cx7="http://schemas.microsoft.com/office/drawing/2016/5/13/chartex" xmlns:cx8="http://schemas.microsoft.com/office/drawing/2016/5/14/chartex" xmlns:mc="http://schemas.openxmlformats.org/markup-compatibility/2006" xmlns:aink="http://schemas.microsoft.com/office/drawing/2016/ink" xmlns:am3d="http://schemas.microsoft.com/office/drawing/2017/model3d" xmlns:o="urn:schemas-microsoft-com:office:office" xmlns:oel="http://schemas.microsoft.com/office/2019/extlst" xmlns:r="http://schemas.openxmlformats.org/officeDocument/2006/relationships" xmlns:m="http://schemas.openxmlformats.org/officeDocument/2006/math" xmlns:v="urn:schemas-microsoft-com:vml" xmlns:wp14="http://schemas.microsoft.com/office/word/2010/wordprocessingDrawing" xmlns:wp="http://schemas.openxmlformats.org/drawingml/2006/wordprocessingDrawing" xmlns:w10="urn:schemas-microsoft-com:office:word" xmlns:w="http://schemas.openxmlformats.org/wordprocessingml/2006/main" xmlns:w14="http://schemas.microsoft.com/office/word/2010/wordml" xmlns:w15="http://schemas.microsoft.com/office/word/2012/wordml" xmlns:w16cex="http://schemas.microsoft.com/office/word/2018/wordml/cex" xmlns:w16cid="http://schemas.microsoft.com/office/word/2016/wordml/cid" xmlns:w16="http://schemas.microsoft.com/office/word/2018/wordml" xmlns:w16du="http://schemas.microsoft.com/office/word/2023/wordml/word16du" xmlns:w16sdtdh="http://schemas.microsoft.com/office/word/2020/wordml/sdtdatahash" xmlns:w16se="http://schemas.microsoft.com/office/word/2015/wordml/symex" xmlns:wpg="http://schemas.microsoft.com/office/word/2010/wordprocessingGroup" xmlns:wpi="http://schemas.microsoft.com/office/word/2010/wordprocessingInk" xmlns:wne="http://schemas.microsoft.com/office/word/2006/wordml" xmlns:wps="http://schemas.microsoft.com/office/word/2010/wordprocessingShape" mc:Ignorable="w14 w15 w16se w16cid w16 w16cex w16sdtdh w16du wp14">
+<w:ftr xmlns:wpc="http://schemas.microsoft.com/office/word/2010/wordprocessingCanvas" xmlns:cx="http://schemas.microsoft.com/office/drawing/2014/chartex" xmlns:cx1="http://schemas.microsoft.com/office/drawing/2015/9/8/chartex" xmlns:cx2="http://schemas.microsoft.com/office/drawing/2015/10/21/chartex" xmlns:cx3="http://schemas.microsoft.com/office/drawing/2016/5/9/chartex" xmlns:cx4="http://schemas.microsoft.com/office/drawing/2016/5/10/chartex" xmlns:cx5="http://schemas.microsoft.com/office/drawing/2016/5/11/chartex" xmlns:cx6="http://schemas.microsoft.com/office/drawing/2016/5/12/chartex" xmlns:cx7="http://schemas.microsoft.com/office/drawing/2016/5/13/chartex" xmlns:cx8="http://schemas.microsoft.com/office/drawing/2016/5/14/chartex" xmlns:mc="http://schemas.openxmlformats.org/markup-compatibility/2006" xmlns:aink="http://schemas.microsoft.com/office/drawing/2016/ink" xmlns:am3d="http://schemas.microsoft.com/office/drawing/2017/model3d" xmlns:o="urn:schemas-microsoft-com:office:office" xmlns:oel="http://schemas.microsoft.com/office/2019/extlst" xmlns:r="http://schemas.openxmlformats.org/officeDocument/2006/relationships" xmlns:m="http://schemas.openxmlformats.org/officeDocument/2006/math" xmlns:v="urn:schemas-microsoft-com:vml" xmlns:wp14="http://schemas.microsoft.com/office/word/2010/wordprocessingDrawing" xmlns:wp="http://schemas.openxmlformats.org/drawingml/2006/wordprocessingDrawing" xmlns:w10="urn:schemas-microsoft-com:office:word" xmlns:w="http://schemas.openxmlformats.org/wordprocessingml/2006/main" xmlns:w14="http://schemas.microsoft.com/office/word/2010/wordml" xmlns:w15="http://schemas.microsoft.com/office/word/2012/wordml" xmlns:w16cex="http://schemas.microsoft.com/office/word/2018/wordml/cex" xmlns:w16cid="http://schemas.microsoft.com/office/word/2016/wordml/cid" xmlns:w16="http://schemas.microsoft.com/office/word/2018/wordml" xmlns:w16du="http://schemas.microsoft.com/office/word/2023/wordml/word16du" xmlns:w16sdtdh="http://schemas.microsoft.com/office/word/2020/wordml/sdtdatahash" xmlns:w16sdtfl="http://schemas.microsoft.com/office/word/2024/wordml/sdtformatlock" xmlns:w16se="http://schemas.microsoft.com/office/word/2015/wordml/symex" xmlns:wpg="http://schemas.microsoft.com/office/word/2010/wordprocessingGroup" xmlns:wpi="http://schemas.microsoft.com/office/word/2010/wordprocessingInk" xmlns:wne="http://schemas.microsoft.com/office/word/2006/wordml" xmlns:wps="http://schemas.microsoft.com/office/word/2010/wordprocessingShape" mc:Ignorable="w14 w15 w16se w16cid w16 w16cex w16sdtdh w16sdtfl w16du wp14">
   <w:p>
     <w:pPr>
       <w:pStyle w:val="Corpsdetexte"/>
@@ -15017,7 +14110,7 @@
 </file>
 
 <file path=word/footer2.xml><?xml version="1.0" encoding="utf-8"?>
-<w:ftr xmlns:wpc="http://schemas.microsoft.com/office/word/2010/wordprocessingCanvas" xmlns:cx="http://schemas.microsoft.com/office/drawing/2014/chartex" xmlns:cx1="http://schemas.microsoft.com/office/drawing/2015/9/8/chartex" xmlns:cx2="http://schemas.microsoft.com/office/drawing/2015/10/21/chartex" xmlns:cx3="http://schemas.microsoft.com/office/drawing/2016/5/9/chartex" xmlns:cx4="http://schemas.microsoft.com/office/drawing/2016/5/10/chartex" xmlns:cx5="http://schemas.microsoft.com/office/drawing/2016/5/11/chartex" xmlns:cx6="http://schemas.microsoft.com/office/drawing/2016/5/12/chartex" xmlns:cx7="http://schemas.microsoft.com/office/drawing/2016/5/13/chartex" xmlns:cx8="http://schemas.microsoft.com/office/drawing/2016/5/14/chartex" xmlns:mc="http://schemas.openxmlformats.org/markup-compatibility/2006" xmlns:aink="http://schemas.microsoft.com/office/drawing/2016/ink" xmlns:am3d="http://schemas.microsoft.com/office/drawing/2017/model3d" xmlns:o="urn:schemas-microsoft-com:office:office" xmlns:oel="http://schemas.microsoft.com/office/2019/extlst" xmlns:r="http://schemas.openxmlformats.org/officeDocument/2006/relationships" xmlns:m="http://schemas.openxmlformats.org/officeDocument/2006/math" xmlns:v="urn:schemas-microsoft-com:vml" xmlns:wp14="http://schemas.microsoft.com/office/word/2010/wordprocessingDrawing" xmlns:wp="http://schemas.openxmlformats.org/drawingml/2006/wordprocessingDrawing" xmlns:w10="urn:schemas-microsoft-com:office:word" xmlns:w="http://schemas.openxmlformats.org/wordprocessingml/2006/main" xmlns:w14="http://schemas.microsoft.com/office/word/2010/wordml" xmlns:w15="http://schemas.microsoft.com/office/word/2012/wordml" xmlns:w16cex="http://schemas.microsoft.com/office/word/2018/wordml/cex" xmlns:w16cid="http://schemas.microsoft.com/office/word/2016/wordml/cid" xmlns:w16="http://schemas.microsoft.com/office/word/2018/wordml" xmlns:w16du="http://schemas.microsoft.com/office/word/2023/wordml/word16du" xmlns:w16sdtdh="http://schemas.microsoft.com/office/word/2020/wordml/sdtdatahash" xmlns:w16se="http://schemas.microsoft.com/office/word/2015/wordml/symex" xmlns:wpg="http://schemas.microsoft.com/office/word/2010/wordprocessingGroup" xmlns:wpi="http://schemas.microsoft.com/office/word/2010/wordprocessingInk" xmlns:wne="http://schemas.microsoft.com/office/word/2006/wordml" xmlns:wps="http://schemas.microsoft.com/office/word/2010/wordprocessingShape" mc:Ignorable="w14 w15 w16se w16cid w16 w16cex w16sdtdh w16du wp14">
+<w:ftr xmlns:wpc="http://schemas.microsoft.com/office/word/2010/wordprocessingCanvas" xmlns:cx="http://schemas.microsoft.com/office/drawing/2014/chartex" xmlns:cx1="http://schemas.microsoft.com/office/drawing/2015/9/8/chartex" xmlns:cx2="http://schemas.microsoft.com/office/drawing/2015/10/21/chartex" xmlns:cx3="http://schemas.microsoft.com/office/drawing/2016/5/9/chartex" xmlns:cx4="http://schemas.microsoft.com/office/drawing/2016/5/10/chartex" xmlns:cx5="http://schemas.microsoft.com/office/drawing/2016/5/11/chartex" xmlns:cx6="http://schemas.microsoft.com/office/drawing/2016/5/12/chartex" xmlns:cx7="http://schemas.microsoft.com/office/drawing/2016/5/13/chartex" xmlns:cx8="http://schemas.microsoft.com/office/drawing/2016/5/14/chartex" xmlns:mc="http://schemas.openxmlformats.org/markup-compatibility/2006" xmlns:aink="http://schemas.microsoft.com/office/drawing/2016/ink" xmlns:am3d="http://schemas.microsoft.com/office/drawing/2017/model3d" xmlns:o="urn:schemas-microsoft-com:office:office" xmlns:oel="http://schemas.microsoft.com/office/2019/extlst" xmlns:r="http://schemas.openxmlformats.org/officeDocument/2006/relationships" xmlns:m="http://schemas.openxmlformats.org/officeDocument/2006/math" xmlns:v="urn:schemas-microsoft-com:vml" xmlns:wp14="http://schemas.microsoft.com/office/word/2010/wordprocessingDrawing" xmlns:wp="http://schemas.openxmlformats.org/drawingml/2006/wordprocessingDrawing" xmlns:w10="urn:schemas-microsoft-com:office:word" xmlns:w="http://schemas.openxmlformats.org/wordprocessingml/2006/main" xmlns:w14="http://schemas.microsoft.com/office/word/2010/wordml" xmlns:w15="http://schemas.microsoft.com/office/word/2012/wordml" xmlns:w16cex="http://schemas.microsoft.com/office/word/2018/wordml/cex" xmlns:w16cid="http://schemas.microsoft.com/office/word/2016/wordml/cid" xmlns:w16="http://schemas.microsoft.com/office/word/2018/wordml" xmlns:w16du="http://schemas.microsoft.com/office/word/2023/wordml/word16du" xmlns:w16sdtdh="http://schemas.microsoft.com/office/word/2020/wordml/sdtdatahash" xmlns:w16sdtfl="http://schemas.microsoft.com/office/word/2024/wordml/sdtformatlock" xmlns:w16se="http://schemas.microsoft.com/office/word/2015/wordml/symex" xmlns:wpg="http://schemas.microsoft.com/office/word/2010/wordprocessingGroup" xmlns:wpi="http://schemas.microsoft.com/office/word/2010/wordprocessingInk" xmlns:wne="http://schemas.microsoft.com/office/word/2006/wordml" xmlns:wps="http://schemas.microsoft.com/office/word/2010/wordprocessingShape" mc:Ignorable="w14 w15 w16se w16cid w16 w16cex w16sdtdh w16sdtfl w16du wp14">
   <w:p>
     <w:pPr>
       <w:pStyle w:val="Corpsdetexte"/>
@@ -15283,7 +14376,7 @@
 </file>
 
 <file path=word/footer3.xml><?xml version="1.0" encoding="utf-8"?>
-<w:ftr xmlns:wpc="http://schemas.microsoft.com/office/word/2010/wordprocessingCanvas" xmlns:cx="http://schemas.microsoft.com/office/drawing/2014/chartex" xmlns:cx1="http://schemas.microsoft.com/office/drawing/2015/9/8/chartex" xmlns:cx2="http://schemas.microsoft.com/office/drawing/2015/10/21/chartex" xmlns:cx3="http://schemas.microsoft.com/office/drawing/2016/5/9/chartex" xmlns:cx4="http://schemas.microsoft.com/office/drawing/2016/5/10/chartex" xmlns:cx5="http://schemas.microsoft.com/office/drawing/2016/5/11/chartex" xmlns:cx6="http://schemas.microsoft.com/office/drawing/2016/5/12/chartex" xmlns:cx7="http://schemas.microsoft.com/office/drawing/2016/5/13/chartex" xmlns:cx8="http://schemas.microsoft.com/office/drawing/2016/5/14/chartex" xmlns:mc="http://schemas.openxmlformats.org/markup-compatibility/2006" xmlns:aink="http://schemas.microsoft.com/office/drawing/2016/ink" xmlns:am3d="http://schemas.microsoft.com/office/drawing/2017/model3d" xmlns:o="urn:schemas-microsoft-com:office:office" xmlns:oel="http://schemas.microsoft.com/office/2019/extlst" xmlns:r="http://schemas.openxmlformats.org/officeDocument/2006/relationships" xmlns:m="http://schemas.openxmlformats.org/officeDocument/2006/math" xmlns:v="urn:schemas-microsoft-com:vml" xmlns:wp14="http://schemas.microsoft.com/office/word/2010/wordprocessingDrawing" xmlns:wp="http://schemas.openxmlformats.org/drawingml/2006/wordprocessingDrawing" xmlns:w10="urn:schemas-microsoft-com:office:word" xmlns:w="http://schemas.openxmlformats.org/wordprocessingml/2006/main" xmlns:w14="http://schemas.microsoft.com/office/word/2010/wordml" xmlns:w15="http://schemas.microsoft.com/office/word/2012/wordml" xmlns:w16cex="http://schemas.microsoft.com/office/word/2018/wordml/cex" xmlns:w16cid="http://schemas.microsoft.com/office/word/2016/wordml/cid" xmlns:w16="http://schemas.microsoft.com/office/word/2018/wordml" xmlns:w16du="http://schemas.microsoft.com/office/word/2023/wordml/word16du" xmlns:w16sdtdh="http://schemas.microsoft.com/office/word/2020/wordml/sdtdatahash" xmlns:w16se="http://schemas.microsoft.com/office/word/2015/wordml/symex" xmlns:wpg="http://schemas.microsoft.com/office/word/2010/wordprocessingGroup" xmlns:wpi="http://schemas.microsoft.com/office/word/2010/wordprocessingInk" xmlns:wne="http://schemas.microsoft.com/office/word/2006/wordml" xmlns:wps="http://schemas.microsoft.com/office/word/2010/wordprocessingShape" mc:Ignorable="w14 w15 w16se w16cid w16 w16cex w16sdtdh w16du wp14">
+<w:ftr xmlns:wpc="http://schemas.microsoft.com/office/word/2010/wordprocessingCanvas" xmlns:cx="http://schemas.microsoft.com/office/drawing/2014/chartex" xmlns:cx1="http://schemas.microsoft.com/office/drawing/2015/9/8/chartex" xmlns:cx2="http://schemas.microsoft.com/office/drawing/2015/10/21/chartex" xmlns:cx3="http://schemas.microsoft.com/office/drawing/2016/5/9/chartex" xmlns:cx4="http://schemas.microsoft.com/office/drawing/2016/5/10/chartex" xmlns:cx5="http://schemas.microsoft.com/office/drawing/2016/5/11/chartex" xmlns:cx6="http://schemas.microsoft.com/office/drawing/2016/5/12/chartex" xmlns:cx7="http://schemas.microsoft.com/office/drawing/2016/5/13/chartex" xmlns:cx8="http://schemas.microsoft.com/office/drawing/2016/5/14/chartex" xmlns:mc="http://schemas.openxmlformats.org/markup-compatibility/2006" xmlns:aink="http://schemas.microsoft.com/office/drawing/2016/ink" xmlns:am3d="http://schemas.microsoft.com/office/drawing/2017/model3d" xmlns:o="urn:schemas-microsoft-com:office:office" xmlns:oel="http://schemas.microsoft.com/office/2019/extlst" xmlns:r="http://schemas.openxmlformats.org/officeDocument/2006/relationships" xmlns:m="http://schemas.openxmlformats.org/officeDocument/2006/math" xmlns:v="urn:schemas-microsoft-com:vml" xmlns:wp14="http://schemas.microsoft.com/office/word/2010/wordprocessingDrawing" xmlns:wp="http://schemas.openxmlformats.org/drawingml/2006/wordprocessingDrawing" xmlns:w10="urn:schemas-microsoft-com:office:word" xmlns:w="http://schemas.openxmlformats.org/wordprocessingml/2006/main" xmlns:w14="http://schemas.microsoft.com/office/word/2010/wordml" xmlns:w15="http://schemas.microsoft.com/office/word/2012/wordml" xmlns:w16cex="http://schemas.microsoft.com/office/word/2018/wordml/cex" xmlns:w16cid="http://schemas.microsoft.com/office/word/2016/wordml/cid" xmlns:w16="http://schemas.microsoft.com/office/word/2018/wordml" xmlns:w16du="http://schemas.microsoft.com/office/word/2023/wordml/word16du" xmlns:w16sdtdh="http://schemas.microsoft.com/office/word/2020/wordml/sdtdatahash" xmlns:w16sdtfl="http://schemas.microsoft.com/office/word/2024/wordml/sdtformatlock" xmlns:w16se="http://schemas.microsoft.com/office/word/2015/wordml/symex" xmlns:wpg="http://schemas.microsoft.com/office/word/2010/wordprocessingGroup" xmlns:wpi="http://schemas.microsoft.com/office/word/2010/wordprocessingInk" xmlns:wne="http://schemas.microsoft.com/office/word/2006/wordml" xmlns:wps="http://schemas.microsoft.com/office/word/2010/wordprocessingShape" mc:Ignorable="w14 w15 w16se w16cid w16 w16cex w16sdtdh w16sdtfl w16du wp14">
   <w:p>
     <w:pPr>
       <w:pStyle w:val="Corpsdetexte"/>
@@ -15549,7 +14642,7 @@
 </file>
 
 <file path=word/footnotes.xml><?xml version="1.0" encoding="utf-8"?>
-<w:footnotes xmlns:wpc="http://schemas.microsoft.com/office/word/2010/wordprocessingCanvas" xmlns:cx="http://schemas.microsoft.com/office/drawing/2014/chartex" xmlns:cx1="http://schemas.microsoft.com/office/drawing/2015/9/8/chartex" xmlns:cx2="http://schemas.microsoft.com/office/drawing/2015/10/21/chartex" xmlns:cx3="http://schemas.microsoft.com/office/drawing/2016/5/9/chartex" xmlns:cx4="http://schemas.microsoft.com/office/drawing/2016/5/10/chartex" xmlns:cx5="http://schemas.microsoft.com/office/drawing/2016/5/11/chartex" xmlns:cx6="http://schemas.microsoft.com/office/drawing/2016/5/12/chartex" xmlns:cx7="http://schemas.microsoft.com/office/drawing/2016/5/13/chartex" xmlns:cx8="http://schemas.microsoft.com/office/drawing/2016/5/14/chartex" xmlns:mc="http://schemas.openxmlformats.org/markup-compatibility/2006" xmlns:aink="http://schemas.microsoft.com/office/drawing/2016/ink" xmlns:am3d="http://schemas.microsoft.com/office/drawing/2017/model3d" xmlns:o="urn:schemas-microsoft-com:office:office" xmlns:oel="http://schemas.microsoft.com/office/2019/extlst" xmlns:r="http://schemas.openxmlformats.org/officeDocument/2006/relationships" xmlns:m="http://schemas.openxmlformats.org/officeDocument/2006/math" xmlns:v="urn:schemas-microsoft-com:vml" xmlns:wp14="http://schemas.microsoft.com/office/word/2010/wordprocessingDrawing" xmlns:wp="http://schemas.openxmlformats.org/drawingml/2006/wordprocessingDrawing" xmlns:w10="urn:schemas-microsoft-com:office:word" xmlns:w="http://schemas.openxmlformats.org/wordprocessingml/2006/main" xmlns:w14="http://schemas.microsoft.com/office/word/2010/wordml" xmlns:w15="http://schemas.microsoft.com/office/word/2012/wordml" xmlns:w16cex="http://schemas.microsoft.com/office/word/2018/wordml/cex" xmlns:w16cid="http://schemas.microsoft.com/office/word/2016/wordml/cid" xmlns:w16="http://schemas.microsoft.com/office/word/2018/wordml" xmlns:w16du="http://schemas.microsoft.com/office/word/2023/wordml/word16du" xmlns:w16sdtdh="http://schemas.microsoft.com/office/word/2020/wordml/sdtdatahash" xmlns:w16se="http://schemas.microsoft.com/office/word/2015/wordml/symex" xmlns:wpg="http://schemas.microsoft.com/office/word/2010/wordprocessingGroup" xmlns:wpi="http://schemas.microsoft.com/office/word/2010/wordprocessingInk" xmlns:wne="http://schemas.microsoft.com/office/word/2006/wordml" xmlns:wps="http://schemas.microsoft.com/office/word/2010/wordprocessingShape" mc:Ignorable="w14 w15 w16se w16cid w16 w16cex w16sdtdh w16du wp14">
+<w:footnotes xmlns:wpc="http://schemas.microsoft.com/office/word/2010/wordprocessingCanvas" xmlns:cx="http://schemas.microsoft.com/office/drawing/2014/chartex" xmlns:cx1="http://schemas.microsoft.com/office/drawing/2015/9/8/chartex" xmlns:cx2="http://schemas.microsoft.com/office/drawing/2015/10/21/chartex" xmlns:cx3="http://schemas.microsoft.com/office/drawing/2016/5/9/chartex" xmlns:cx4="http://schemas.microsoft.com/office/drawing/2016/5/10/chartex" xmlns:cx5="http://schemas.microsoft.com/office/drawing/2016/5/11/chartex" xmlns:cx6="http://schemas.microsoft.com/office/drawing/2016/5/12/chartex" xmlns:cx7="http://schemas.microsoft.com/office/drawing/2016/5/13/chartex" xmlns:cx8="http://schemas.microsoft.com/office/drawing/2016/5/14/chartex" xmlns:mc="http://schemas.openxmlformats.org/markup-compatibility/2006" xmlns:aink="http://schemas.microsoft.com/office/drawing/2016/ink" xmlns:am3d="http://schemas.microsoft.com/office/drawing/2017/model3d" xmlns:o="urn:schemas-microsoft-com:office:office" xmlns:oel="http://schemas.microsoft.com/office/2019/extlst" xmlns:r="http://schemas.openxmlformats.org/officeDocument/2006/relationships" xmlns:m="http://schemas.openxmlformats.org/officeDocument/2006/math" xmlns:v="urn:schemas-microsoft-com:vml" xmlns:wp14="http://schemas.microsoft.com/office/word/2010/wordprocessingDrawing" xmlns:wp="http://schemas.openxmlformats.org/drawingml/2006/wordprocessingDrawing" xmlns:w10="urn:schemas-microsoft-com:office:word" xmlns:w="http://schemas.openxmlformats.org/wordprocessingml/2006/main" xmlns:w14="http://schemas.microsoft.com/office/word/2010/wordml" xmlns:w15="http://schemas.microsoft.com/office/word/2012/wordml" xmlns:w16cex="http://schemas.microsoft.com/office/word/2018/wordml/cex" xmlns:w16cid="http://schemas.microsoft.com/office/word/2016/wordml/cid" xmlns:w16="http://schemas.microsoft.com/office/word/2018/wordml" xmlns:w16du="http://schemas.microsoft.com/office/word/2023/wordml/word16du" xmlns:w16sdtdh="http://schemas.microsoft.com/office/word/2020/wordml/sdtdatahash" xmlns:w16sdtfl="http://schemas.microsoft.com/office/word/2024/wordml/sdtformatlock" xmlns:w16se="http://schemas.microsoft.com/office/word/2015/wordml/symex" xmlns:wpg="http://schemas.microsoft.com/office/word/2010/wordprocessingGroup" xmlns:wpi="http://schemas.microsoft.com/office/word/2010/wordprocessingInk" xmlns:wne="http://schemas.microsoft.com/office/word/2006/wordml" xmlns:wps="http://schemas.microsoft.com/office/word/2010/wordprocessingShape" mc:Ignorable="w14 w15 w16se w16cid w16 w16cex w16sdtdh w16sdtfl w16du wp14">
   <w:footnote w:type="separator" w:id="-1">
     <w:p>
       <w:r>
@@ -15568,7 +14661,7 @@
 </file>
 
 <file path=word/header1.xml><?xml version="1.0" encoding="utf-8"?>
-<w:hdr xmlns:wpc="http://schemas.microsoft.com/office/word/2010/wordprocessingCanvas" xmlns:cx="http://schemas.microsoft.com/office/drawing/2014/chartex" xmlns:cx1="http://schemas.microsoft.com/office/drawing/2015/9/8/chartex" xmlns:cx2="http://schemas.microsoft.com/office/drawing/2015/10/21/chartex" xmlns:cx3="http://schemas.microsoft.com/office/drawing/2016/5/9/chartex" xmlns:cx4="http://schemas.microsoft.com/office/drawing/2016/5/10/chartex" xmlns:cx5="http://schemas.microsoft.com/office/drawing/2016/5/11/chartex" xmlns:cx6="http://schemas.microsoft.com/office/drawing/2016/5/12/chartex" xmlns:cx7="http://schemas.microsoft.com/office/drawing/2016/5/13/chartex" xmlns:cx8="http://schemas.microsoft.com/office/drawing/2016/5/14/chartex" xmlns:mc="http://schemas.openxmlformats.org/markup-compatibility/2006" xmlns:aink="http://schemas.microsoft.com/office/drawing/2016/ink" xmlns:am3d="http://schemas.microsoft.com/office/drawing/2017/model3d" xmlns:o="urn:schemas-microsoft-com:office:office" xmlns:oel="http://schemas.microsoft.com/office/2019/extlst" xmlns:r="http://schemas.openxmlformats.org/officeDocument/2006/relationships" xmlns:m="http://schemas.openxmlformats.org/officeDocument/2006/math" xmlns:v="urn:schemas-microsoft-com:vml" xmlns:wp14="http://schemas.microsoft.com/office/word/2010/wordprocessingDrawing" xmlns:wp="http://schemas.openxmlformats.org/drawingml/2006/wordprocessingDrawing" xmlns:w10="urn:schemas-microsoft-com:office:word" xmlns:w="http://schemas.openxmlformats.org/wordprocessingml/2006/main" xmlns:w14="http://schemas.microsoft.com/office/word/2010/wordml" xmlns:w15="http://schemas.microsoft.com/office/word/2012/wordml" xmlns:w16cex="http://schemas.microsoft.com/office/word/2018/wordml/cex" xmlns:w16cid="http://schemas.microsoft.com/office/word/2016/wordml/cid" xmlns:w16="http://schemas.microsoft.com/office/word/2018/wordml" xmlns:w16du="http://schemas.microsoft.com/office/word/2023/wordml/word16du" xmlns:w16sdtdh="http://schemas.microsoft.com/office/word/2020/wordml/sdtdatahash" xmlns:w16se="http://schemas.microsoft.com/office/word/2015/wordml/symex" xmlns:wpg="http://schemas.microsoft.com/office/word/2010/wordprocessingGroup" xmlns:wpi="http://schemas.microsoft.com/office/word/2010/wordprocessingInk" xmlns:wne="http://schemas.microsoft.com/office/word/2006/wordml" xmlns:wps="http://schemas.microsoft.com/office/word/2010/wordprocessingShape" mc:Ignorable="w14 w15 w16se w16cid w16 w16cex w16sdtdh w16du wp14">
+<w:hdr xmlns:wpc="http://schemas.microsoft.com/office/word/2010/wordprocessingCanvas" xmlns:cx="http://schemas.microsoft.com/office/drawing/2014/chartex" xmlns:cx1="http://schemas.microsoft.com/office/drawing/2015/9/8/chartex" xmlns:cx2="http://schemas.microsoft.com/office/drawing/2015/10/21/chartex" xmlns:cx3="http://schemas.microsoft.com/office/drawing/2016/5/9/chartex" xmlns:cx4="http://schemas.microsoft.com/office/drawing/2016/5/10/chartex" xmlns:cx5="http://schemas.microsoft.com/office/drawing/2016/5/11/chartex" xmlns:cx6="http://schemas.microsoft.com/office/drawing/2016/5/12/chartex" xmlns:cx7="http://schemas.microsoft.com/office/drawing/2016/5/13/chartex" xmlns:cx8="http://schemas.microsoft.com/office/drawing/2016/5/14/chartex" xmlns:mc="http://schemas.openxmlformats.org/markup-compatibility/2006" xmlns:aink="http://schemas.microsoft.com/office/drawing/2016/ink" xmlns:am3d="http://schemas.microsoft.com/office/drawing/2017/model3d" xmlns:o="urn:schemas-microsoft-com:office:office" xmlns:oel="http://schemas.microsoft.com/office/2019/extlst" xmlns:r="http://schemas.openxmlformats.org/officeDocument/2006/relationships" xmlns:m="http://schemas.openxmlformats.org/officeDocument/2006/math" xmlns:v="urn:schemas-microsoft-com:vml" xmlns:wp14="http://schemas.microsoft.com/office/word/2010/wordprocessingDrawing" xmlns:wp="http://schemas.openxmlformats.org/drawingml/2006/wordprocessingDrawing" xmlns:w10="urn:schemas-microsoft-com:office:word" xmlns:w="http://schemas.openxmlformats.org/wordprocessingml/2006/main" xmlns:w14="http://schemas.microsoft.com/office/word/2010/wordml" xmlns:w15="http://schemas.microsoft.com/office/word/2012/wordml" xmlns:w16cex="http://schemas.microsoft.com/office/word/2018/wordml/cex" xmlns:w16cid="http://schemas.microsoft.com/office/word/2016/wordml/cid" xmlns:w16="http://schemas.microsoft.com/office/word/2018/wordml" xmlns:w16du="http://schemas.microsoft.com/office/word/2023/wordml/word16du" xmlns:w16sdtdh="http://schemas.microsoft.com/office/word/2020/wordml/sdtdatahash" xmlns:w16sdtfl="http://schemas.microsoft.com/office/word/2024/wordml/sdtformatlock" xmlns:w16se="http://schemas.microsoft.com/office/word/2015/wordml/symex" xmlns:wpg="http://schemas.microsoft.com/office/word/2010/wordprocessingGroup" xmlns:wpi="http://schemas.microsoft.com/office/word/2010/wordprocessingInk" xmlns:wne="http://schemas.microsoft.com/office/word/2006/wordml" xmlns:wps="http://schemas.microsoft.com/office/word/2010/wordprocessingShape" mc:Ignorable="w14 w15 w16se w16cid w16 w16cex w16sdtdh w16sdtfl w16du wp14">
   <w:p>
     <w:pPr>
       <w:pStyle w:val="Corpsdetexte"/>
@@ -15777,14 +14870,12 @@
                               <w:rFonts w:ascii="Arial MT"/>
                             </w:rPr>
                           </w:pPr>
-                          <w:proofErr w:type="spellStart"/>
                           <w:r>
                             <w:rPr>
                               <w:rFonts w:ascii="Arial MT"/>
                             </w:rPr>
                             <w:t>Logic@l</w:t>
                           </w:r>
-                          <w:proofErr w:type="spellEnd"/>
                           <w:r>
                             <w:rPr>
                               <w:rFonts w:ascii="Arial MT"/>
@@ -15824,14 +14915,12 @@
                         <w:rFonts w:ascii="Arial MT"/>
                       </w:rPr>
                     </w:pPr>
-                    <w:proofErr w:type="spellStart"/>
                     <w:r>
                       <w:rPr>
                         <w:rFonts w:ascii="Arial MT"/>
                       </w:rPr>
                       <w:t>Logic@l</w:t>
                     </w:r>
-                    <w:proofErr w:type="spellEnd"/>
                     <w:r>
                       <w:rPr>
                         <w:rFonts w:ascii="Arial MT"/>
@@ -15860,7 +14949,7 @@
 </file>
 
 <file path=word/header2.xml><?xml version="1.0" encoding="utf-8"?>
-<w:hdr xmlns:wpc="http://schemas.microsoft.com/office/word/2010/wordprocessingCanvas" xmlns:cx="http://schemas.microsoft.com/office/drawing/2014/chartex" xmlns:cx1="http://schemas.microsoft.com/office/drawing/2015/9/8/chartex" xmlns:cx2="http://schemas.microsoft.com/office/drawing/2015/10/21/chartex" xmlns:cx3="http://schemas.microsoft.com/office/drawing/2016/5/9/chartex" xmlns:cx4="http://schemas.microsoft.com/office/drawing/2016/5/10/chartex" xmlns:cx5="http://schemas.microsoft.com/office/drawing/2016/5/11/chartex" xmlns:cx6="http://schemas.microsoft.com/office/drawing/2016/5/12/chartex" xmlns:cx7="http://schemas.microsoft.com/office/drawing/2016/5/13/chartex" xmlns:cx8="http://schemas.microsoft.com/office/drawing/2016/5/14/chartex" xmlns:mc="http://schemas.openxmlformats.org/markup-compatibility/2006" xmlns:aink="http://schemas.microsoft.com/office/drawing/2016/ink" xmlns:am3d="http://schemas.microsoft.com/office/drawing/2017/model3d" xmlns:o="urn:schemas-microsoft-com:office:office" xmlns:oel="http://schemas.microsoft.com/office/2019/extlst" xmlns:r="http://schemas.openxmlformats.org/officeDocument/2006/relationships" xmlns:m="http://schemas.openxmlformats.org/officeDocument/2006/math" xmlns:v="urn:schemas-microsoft-com:vml" xmlns:wp14="http://schemas.microsoft.com/office/word/2010/wordprocessingDrawing" xmlns:wp="http://schemas.openxmlformats.org/drawingml/2006/wordprocessingDrawing" xmlns:w10="urn:schemas-microsoft-com:office:word" xmlns:w="http://schemas.openxmlformats.org/wordprocessingml/2006/main" xmlns:w14="http://schemas.microsoft.com/office/word/2010/wordml" xmlns:w15="http://schemas.microsoft.com/office/word/2012/wordml" xmlns:w16cex="http://schemas.microsoft.com/office/word/2018/wordml/cex" xmlns:w16cid="http://schemas.microsoft.com/office/word/2016/wordml/cid" xmlns:w16="http://schemas.microsoft.com/office/word/2018/wordml" xmlns:w16du="http://schemas.microsoft.com/office/word/2023/wordml/word16du" xmlns:w16sdtdh="http://schemas.microsoft.com/office/word/2020/wordml/sdtdatahash" xmlns:w16se="http://schemas.microsoft.com/office/word/2015/wordml/symex" xmlns:wpg="http://schemas.microsoft.com/office/word/2010/wordprocessingGroup" xmlns:wpi="http://schemas.microsoft.com/office/word/2010/wordprocessingInk" xmlns:wne="http://schemas.microsoft.com/office/word/2006/wordml" xmlns:wps="http://schemas.microsoft.com/office/word/2010/wordprocessingShape" mc:Ignorable="w14 w15 w16se w16cid w16 w16cex w16sdtdh w16du wp14">
+<w:hdr xmlns:wpc="http://schemas.microsoft.com/office/word/2010/wordprocessingCanvas" xmlns:cx="http://schemas.microsoft.com/office/drawing/2014/chartex" xmlns:cx1="http://schemas.microsoft.com/office/drawing/2015/9/8/chartex" xmlns:cx2="http://schemas.microsoft.com/office/drawing/2015/10/21/chartex" xmlns:cx3="http://schemas.microsoft.com/office/drawing/2016/5/9/chartex" xmlns:cx4="http://schemas.microsoft.com/office/drawing/2016/5/10/chartex" xmlns:cx5="http://schemas.microsoft.com/office/drawing/2016/5/11/chartex" xmlns:cx6="http://schemas.microsoft.com/office/drawing/2016/5/12/chartex" xmlns:cx7="http://schemas.microsoft.com/office/drawing/2016/5/13/chartex" xmlns:cx8="http://schemas.microsoft.com/office/drawing/2016/5/14/chartex" xmlns:mc="http://schemas.openxmlformats.org/markup-compatibility/2006" xmlns:aink="http://schemas.microsoft.com/office/drawing/2016/ink" xmlns:am3d="http://schemas.microsoft.com/office/drawing/2017/model3d" xmlns:o="urn:schemas-microsoft-com:office:office" xmlns:oel="http://schemas.microsoft.com/office/2019/extlst" xmlns:r="http://schemas.openxmlformats.org/officeDocument/2006/relationships" xmlns:m="http://schemas.openxmlformats.org/officeDocument/2006/math" xmlns:v="urn:schemas-microsoft-com:vml" xmlns:wp14="http://schemas.microsoft.com/office/word/2010/wordprocessingDrawing" xmlns:wp="http://schemas.openxmlformats.org/drawingml/2006/wordprocessingDrawing" xmlns:w10="urn:schemas-microsoft-com:office:word" xmlns:w="http://schemas.openxmlformats.org/wordprocessingml/2006/main" xmlns:w14="http://schemas.microsoft.com/office/word/2010/wordml" xmlns:w15="http://schemas.microsoft.com/office/word/2012/wordml" xmlns:w16cex="http://schemas.microsoft.com/office/word/2018/wordml/cex" xmlns:w16cid="http://schemas.microsoft.com/office/word/2016/wordml/cid" xmlns:w16="http://schemas.microsoft.com/office/word/2018/wordml" xmlns:w16du="http://schemas.microsoft.com/office/word/2023/wordml/word16du" xmlns:w16sdtdh="http://schemas.microsoft.com/office/word/2020/wordml/sdtdatahash" xmlns:w16sdtfl="http://schemas.microsoft.com/office/word/2024/wordml/sdtformatlock" xmlns:w16se="http://schemas.microsoft.com/office/word/2015/wordml/symex" xmlns:wpg="http://schemas.microsoft.com/office/word/2010/wordprocessingGroup" xmlns:wpi="http://schemas.microsoft.com/office/word/2010/wordprocessingInk" xmlns:wne="http://schemas.microsoft.com/office/word/2006/wordml" xmlns:wps="http://schemas.microsoft.com/office/word/2010/wordprocessingShape" mc:Ignorable="w14 w15 w16se w16cid w16 w16cex w16sdtdh w16sdtfl w16du wp14">
   <w:p>
     <w:pPr>
       <w:pStyle w:val="Corpsdetexte"/>
@@ -15948,7 +15037,7 @@
         </mc:Choice>
         <mc:Fallback>
           <w:pict>
-            <v:shape w14:anchorId="3017D79A" id="Graphic 8" o:spid="_x0000_s1026" style="position:absolute;margin-left:113.8pt;margin-top:107.2pt;width:369.95pt;height:.5pt;z-index:-15924224;visibility:visible;mso-wrap-style:square;mso-wrap-distance-left:0;mso-wrap-distance-top:0;mso-wrap-distance-right:0;mso-wrap-distance-bottom:0;mso-position-horizontal:absolute;mso-position-horizontal-relative:page;mso-position-vertical:absolute;mso-position-vertical-relative:page;v-text-anchor:top" coordsize="4698365,6350" o:gfxdata="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" path="m4697857,l,,,6096r4697857,l4697857,xe" fillcolor="#5b9bd4" stroked="f">
+            <v:shape w14:anchorId="3D36B5AE" id="Graphic 8" o:spid="_x0000_s1026" style="position:absolute;margin-left:113.8pt;margin-top:107.2pt;width:369.95pt;height:.5pt;z-index:-15924224;visibility:visible;mso-wrap-style:square;mso-wrap-distance-left:0;mso-wrap-distance-top:0;mso-wrap-distance-right:0;mso-wrap-distance-bottom:0;mso-position-horizontal:absolute;mso-position-horizontal-relative:page;mso-position-vertical:absolute;mso-position-vertical-relative:page;v-text-anchor:top" coordsize="4698365,6350" o:gfxdata="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" path="m4697857,l,,,6096r4697857,l4697857,xe" fillcolor="#5b9bd4" stroked="f">
               <v:path arrowok="t"/>
               <w10:wrap anchorx="page" anchory="page"/>
             </v:shape>
@@ -16156,14 +15245,12 @@
                               <w:rFonts w:ascii="Arial MT"/>
                             </w:rPr>
                           </w:pPr>
-                          <w:proofErr w:type="spellStart"/>
                           <w:r>
                             <w:rPr>
                               <w:rFonts w:ascii="Arial MT"/>
                             </w:rPr>
                             <w:t>Logic@l</w:t>
                           </w:r>
-                          <w:proofErr w:type="spellEnd"/>
                           <w:r>
                             <w:rPr>
                               <w:rFonts w:ascii="Arial MT"/>
@@ -16203,14 +15290,12 @@
                         <w:rFonts w:ascii="Arial MT"/>
                       </w:rPr>
                     </w:pPr>
-                    <w:proofErr w:type="spellStart"/>
                     <w:r>
                       <w:rPr>
                         <w:rFonts w:ascii="Arial MT"/>
                       </w:rPr>
                       <w:t>Logic@l</w:t>
                     </w:r>
-                    <w:proofErr w:type="spellEnd"/>
                     <w:r>
                       <w:rPr>
                         <w:rFonts w:ascii="Arial MT"/>
@@ -16239,7 +15324,7 @@
 </file>
 
 <file path=word/header3.xml><?xml version="1.0" encoding="utf-8"?>
-<w:hdr xmlns:wpc="http://schemas.microsoft.com/office/word/2010/wordprocessingCanvas" xmlns:cx="http://schemas.microsoft.com/office/drawing/2014/chartex" xmlns:cx1="http://schemas.microsoft.com/office/drawing/2015/9/8/chartex" xmlns:cx2="http://schemas.microsoft.com/office/drawing/2015/10/21/chartex" xmlns:cx3="http://schemas.microsoft.com/office/drawing/2016/5/9/chartex" xmlns:cx4="http://schemas.microsoft.com/office/drawing/2016/5/10/chartex" xmlns:cx5="http://schemas.microsoft.com/office/drawing/2016/5/11/chartex" xmlns:cx6="http://schemas.microsoft.com/office/drawing/2016/5/12/chartex" xmlns:cx7="http://schemas.microsoft.com/office/drawing/2016/5/13/chartex" xmlns:cx8="http://schemas.microsoft.com/office/drawing/2016/5/14/chartex" xmlns:mc="http://schemas.openxmlformats.org/markup-compatibility/2006" xmlns:aink="http://schemas.microsoft.com/office/drawing/2016/ink" xmlns:am3d="http://schemas.microsoft.com/office/drawing/2017/model3d" xmlns:o="urn:schemas-microsoft-com:office:office" xmlns:oel="http://schemas.microsoft.com/office/2019/extlst" xmlns:r="http://schemas.openxmlformats.org/officeDocument/2006/relationships" xmlns:m="http://schemas.openxmlformats.org/officeDocument/2006/math" xmlns:v="urn:schemas-microsoft-com:vml" xmlns:wp14="http://schemas.microsoft.com/office/word/2010/wordprocessingDrawing" xmlns:wp="http://schemas.openxmlformats.org/drawingml/2006/wordprocessingDrawing" xmlns:w10="urn:schemas-microsoft-com:office:word" xmlns:w="http://schemas.openxmlformats.org/wordprocessingml/2006/main" xmlns:w14="http://schemas.microsoft.com/office/word/2010/wordml" xmlns:w15="http://schemas.microsoft.com/office/word/2012/wordml" xmlns:w16cex="http://schemas.microsoft.com/office/word/2018/wordml/cex" xmlns:w16cid="http://schemas.microsoft.com/office/word/2016/wordml/cid" xmlns:w16="http://schemas.microsoft.com/office/word/2018/wordml" xmlns:w16du="http://schemas.microsoft.com/office/word/2023/wordml/word16du" xmlns:w16sdtdh="http://schemas.microsoft.com/office/word/2020/wordml/sdtdatahash" xmlns:w16se="http://schemas.microsoft.com/office/word/2015/wordml/symex" xmlns:wpg="http://schemas.microsoft.com/office/word/2010/wordprocessingGroup" xmlns:wpi="http://schemas.microsoft.com/office/word/2010/wordprocessingInk" xmlns:wne="http://schemas.microsoft.com/office/word/2006/wordml" xmlns:wps="http://schemas.microsoft.com/office/word/2010/wordprocessingShape" mc:Ignorable="w14 w15 w16se w16cid w16 w16cex w16sdtdh w16du wp14">
+<w:hdr xmlns:wpc="http://schemas.microsoft.com/office/word/2010/wordprocessingCanvas" xmlns:cx="http://schemas.microsoft.com/office/drawing/2014/chartex" xmlns:cx1="http://schemas.microsoft.com/office/drawing/2015/9/8/chartex" xmlns:cx2="http://schemas.microsoft.com/office/drawing/2015/10/21/chartex" xmlns:cx3="http://schemas.microsoft.com/office/drawing/2016/5/9/chartex" xmlns:cx4="http://schemas.microsoft.com/office/drawing/2016/5/10/chartex" xmlns:cx5="http://schemas.microsoft.com/office/drawing/2016/5/11/chartex" xmlns:cx6="http://schemas.microsoft.com/office/drawing/2016/5/12/chartex" xmlns:cx7="http://schemas.microsoft.com/office/drawing/2016/5/13/chartex" xmlns:cx8="http://schemas.microsoft.com/office/drawing/2016/5/14/chartex" xmlns:mc="http://schemas.openxmlformats.org/markup-compatibility/2006" xmlns:aink="http://schemas.microsoft.com/office/drawing/2016/ink" xmlns:am3d="http://schemas.microsoft.com/office/drawing/2017/model3d" xmlns:o="urn:schemas-microsoft-com:office:office" xmlns:oel="http://schemas.microsoft.com/office/2019/extlst" xmlns:r="http://schemas.openxmlformats.org/officeDocument/2006/relationships" xmlns:m="http://schemas.openxmlformats.org/officeDocument/2006/math" xmlns:v="urn:schemas-microsoft-com:vml" xmlns:wp14="http://schemas.microsoft.com/office/word/2010/wordprocessingDrawing" xmlns:wp="http://schemas.openxmlformats.org/drawingml/2006/wordprocessingDrawing" xmlns:w10="urn:schemas-microsoft-com:office:word" xmlns:w="http://schemas.openxmlformats.org/wordprocessingml/2006/main" xmlns:w14="http://schemas.microsoft.com/office/word/2010/wordml" xmlns:w15="http://schemas.microsoft.com/office/word/2012/wordml" xmlns:w16cex="http://schemas.microsoft.com/office/word/2018/wordml/cex" xmlns:w16cid="http://schemas.microsoft.com/office/word/2016/wordml/cid" xmlns:w16="http://schemas.microsoft.com/office/word/2018/wordml" xmlns:w16du="http://schemas.microsoft.com/office/word/2023/wordml/word16du" xmlns:w16sdtdh="http://schemas.microsoft.com/office/word/2020/wordml/sdtdatahash" xmlns:w16sdtfl="http://schemas.microsoft.com/office/word/2024/wordml/sdtformatlock" xmlns:w16se="http://schemas.microsoft.com/office/word/2015/wordml/symex" xmlns:wpg="http://schemas.microsoft.com/office/word/2010/wordprocessingGroup" xmlns:wpi="http://schemas.microsoft.com/office/word/2010/wordprocessingInk" xmlns:wne="http://schemas.microsoft.com/office/word/2006/wordml" xmlns:wps="http://schemas.microsoft.com/office/word/2010/wordprocessingShape" mc:Ignorable="w14 w15 w16se w16cid w16 w16cex w16sdtdh w16sdtfl w16du wp14">
   <w:p>
     <w:pPr>
       <w:pStyle w:val="Corpsdetexte"/>
@@ -16448,14 +15533,12 @@
                               <w:rFonts w:ascii="Arial MT"/>
                             </w:rPr>
                           </w:pPr>
-                          <w:proofErr w:type="spellStart"/>
                           <w:r>
                             <w:rPr>
                               <w:rFonts w:ascii="Arial MT"/>
                             </w:rPr>
                             <w:t>Logic@l</w:t>
                           </w:r>
-                          <w:proofErr w:type="spellEnd"/>
                           <w:r>
                             <w:rPr>
                               <w:rFonts w:ascii="Arial MT"/>
@@ -16495,14 +15578,12 @@
                         <w:rFonts w:ascii="Arial MT"/>
                       </w:rPr>
                     </w:pPr>
-                    <w:proofErr w:type="spellStart"/>
                     <w:r>
                       <w:rPr>
                         <w:rFonts w:ascii="Arial MT"/>
                       </w:rPr>
                       <w:t>Logic@l</w:t>
                     </w:r>
-                    <w:proofErr w:type="spellEnd"/>
                     <w:r>
                       <w:rPr>
                         <w:rFonts w:ascii="Arial MT"/>
@@ -16531,7 +15612,7 @@
 </file>
 
 <file path=word/numbering.xml><?xml version="1.0" encoding="utf-8"?>
-<w:numbering xmlns:wpc="http://schemas.microsoft.com/office/word/2010/wordprocessingCanvas" xmlns:cx="http://schemas.microsoft.com/office/drawing/2014/chartex" xmlns:cx1="http://schemas.microsoft.com/office/drawing/2015/9/8/chartex" xmlns:cx2="http://schemas.microsoft.com/office/drawing/2015/10/21/chartex" xmlns:cx3="http://schemas.microsoft.com/office/drawing/2016/5/9/chartex" xmlns:cx4="http://schemas.microsoft.com/office/drawing/2016/5/10/chartex" xmlns:cx5="http://schemas.microsoft.com/office/drawing/2016/5/11/chartex" xmlns:cx6="http://schemas.microsoft.com/office/drawing/2016/5/12/chartex" xmlns:cx7="http://schemas.microsoft.com/office/drawing/2016/5/13/chartex" xmlns:cx8="http://schemas.microsoft.com/office/drawing/2016/5/14/chartex" xmlns:mc="http://schemas.openxmlformats.org/markup-compatibility/2006" xmlns:aink="http://schemas.microsoft.com/office/drawing/2016/ink" xmlns:am3d="http://schemas.microsoft.com/office/drawing/2017/model3d" xmlns:o="urn:schemas-microsoft-com:office:office" xmlns:oel="http://schemas.microsoft.com/office/2019/extlst" xmlns:r="http://schemas.openxmlformats.org/officeDocument/2006/relationships" xmlns:m="http://schemas.openxmlformats.org/officeDocument/2006/math" xmlns:v="urn:schemas-microsoft-com:vml" xmlns:wp14="http://schemas.microsoft.com/office/word/2010/wordprocessingDrawing" xmlns:wp="http://schemas.openxmlformats.org/drawingml/2006/wordprocessingDrawing" xmlns:w10="urn:schemas-microsoft-com:office:word" xmlns:w="http://schemas.openxmlformats.org/wordprocessingml/2006/main" xmlns:w14="http://schemas.microsoft.com/office/word/2010/wordml" xmlns:w15="http://schemas.microsoft.com/office/word/2012/wordml" xmlns:w16cex="http://schemas.microsoft.com/office/word/2018/wordml/cex" xmlns:w16cid="http://schemas.microsoft.com/office/word/2016/wordml/cid" xmlns:w16="http://schemas.microsoft.com/office/word/2018/wordml" xmlns:w16du="http://schemas.microsoft.com/office/word/2023/wordml/word16du" xmlns:w16sdtdh="http://schemas.microsoft.com/office/word/2020/wordml/sdtdatahash" xmlns:w16se="http://schemas.microsoft.com/office/word/2015/wordml/symex" xmlns:wpg="http://schemas.microsoft.com/office/word/2010/wordprocessingGroup" xmlns:wpi="http://schemas.microsoft.com/office/word/2010/wordprocessingInk" xmlns:wne="http://schemas.microsoft.com/office/word/2006/wordml" xmlns:wps="http://schemas.microsoft.com/office/word/2010/wordprocessingShape" mc:Ignorable="w14 w15 w16se w16cid w16 w16cex w16sdtdh w16du wp14">
+<w:numbering xmlns:wpc="http://schemas.microsoft.com/office/word/2010/wordprocessingCanvas" xmlns:cx="http://schemas.microsoft.com/office/drawing/2014/chartex" xmlns:cx1="http://schemas.microsoft.com/office/drawing/2015/9/8/chartex" xmlns:cx2="http://schemas.microsoft.com/office/drawing/2015/10/21/chartex" xmlns:cx3="http://schemas.microsoft.com/office/drawing/2016/5/9/chartex" xmlns:cx4="http://schemas.microsoft.com/office/drawing/2016/5/10/chartex" xmlns:cx5="http://schemas.microsoft.com/office/drawing/2016/5/11/chartex" xmlns:cx6="http://schemas.microsoft.com/office/drawing/2016/5/12/chartex" xmlns:cx7="http://schemas.microsoft.com/office/drawing/2016/5/13/chartex" xmlns:cx8="http://schemas.microsoft.com/office/drawing/2016/5/14/chartex" xmlns:mc="http://schemas.openxmlformats.org/markup-compatibility/2006" xmlns:aink="http://schemas.microsoft.com/office/drawing/2016/ink" xmlns:am3d="http://schemas.microsoft.com/office/drawing/2017/model3d" xmlns:o="urn:schemas-microsoft-com:office:office" xmlns:oel="http://schemas.microsoft.com/office/2019/extlst" xmlns:r="http://schemas.openxmlformats.org/officeDocument/2006/relationships" xmlns:m="http://schemas.openxmlformats.org/officeDocument/2006/math" xmlns:v="urn:schemas-microsoft-com:vml" xmlns:wp14="http://schemas.microsoft.com/office/word/2010/wordprocessingDrawing" xmlns:wp="http://schemas.openxmlformats.org/drawingml/2006/wordprocessingDrawing" xmlns:w10="urn:schemas-microsoft-com:office:word" xmlns:w="http://schemas.openxmlformats.org/wordprocessingml/2006/main" xmlns:w14="http://schemas.microsoft.com/office/word/2010/wordml" xmlns:w15="http://schemas.microsoft.com/office/word/2012/wordml" xmlns:w16cex="http://schemas.microsoft.com/office/word/2018/wordml/cex" xmlns:w16cid="http://schemas.microsoft.com/office/word/2016/wordml/cid" xmlns:w16="http://schemas.microsoft.com/office/word/2018/wordml" xmlns:w16du="http://schemas.microsoft.com/office/word/2023/wordml/word16du" xmlns:w16sdtdh="http://schemas.microsoft.com/office/word/2020/wordml/sdtdatahash" xmlns:w16sdtfl="http://schemas.microsoft.com/office/word/2024/wordml/sdtformatlock" xmlns:w16se="http://schemas.microsoft.com/office/word/2015/wordml/symex" xmlns:wpg="http://schemas.microsoft.com/office/word/2010/wordprocessingGroup" xmlns:wpi="http://schemas.microsoft.com/office/word/2010/wordprocessingInk" xmlns:wne="http://schemas.microsoft.com/office/word/2006/wordml" xmlns:wps="http://schemas.microsoft.com/office/word/2010/wordprocessingShape" mc:Ignorable="w14 w15 w16se w16cid w16 w16cex w16sdtdh w16sdtfl w16du wp14">
   <w:abstractNum w:abstractNumId="0" w15:restartNumberingAfterBreak="0">
     <w:nsid w:val="24B455C2"/>
     <w:multiLevelType w:val="hybridMultilevel"/>
@@ -16910,7 +15991,7 @@
 </file>
 
 <file path=word/styles.xml><?xml version="1.0" encoding="utf-8"?>
-<w:styles xmlns:mc="http://schemas.openxmlformats.org/markup-compatibility/2006" xmlns:r="http://schemas.openxmlformats.org/officeDocument/2006/relationships" xmlns:w="http://schemas.openxmlformats.org/wordprocessingml/2006/main" xmlns:w14="http://schemas.microsoft.com/office/word/2010/wordml" xmlns:w15="http://schemas.microsoft.com/office/word/2012/wordml" xmlns:w16cex="http://schemas.microsoft.com/office/word/2018/wordml/cex" xmlns:w16cid="http://schemas.microsoft.com/office/word/2016/wordml/cid" xmlns:w16="http://schemas.microsoft.com/office/word/2018/wordml" xmlns:w16du="http://schemas.microsoft.com/office/word/2023/wordml/word16du" xmlns:w16sdtdh="http://schemas.microsoft.com/office/word/2020/wordml/sdtdatahash" xmlns:w16se="http://schemas.microsoft.com/office/word/2015/wordml/symex" mc:Ignorable="w14 w15 w16se w16cid w16 w16cex w16sdtdh w16du">
+<w:styles xmlns:mc="http://schemas.openxmlformats.org/markup-compatibility/2006" xmlns:r="http://schemas.openxmlformats.org/officeDocument/2006/relationships" xmlns:w="http://schemas.openxmlformats.org/wordprocessingml/2006/main" xmlns:w14="http://schemas.microsoft.com/office/word/2010/wordml" xmlns:w15="http://schemas.microsoft.com/office/word/2012/wordml" xmlns:w16cex="http://schemas.microsoft.com/office/word/2018/wordml/cex" xmlns:w16cid="http://schemas.microsoft.com/office/word/2016/wordml/cid" xmlns:w16="http://schemas.microsoft.com/office/word/2018/wordml" xmlns:w16du="http://schemas.microsoft.com/office/word/2023/wordml/word16du" xmlns:w16sdtdh="http://schemas.microsoft.com/office/word/2020/wordml/sdtdatahash" xmlns:w16sdtfl="http://schemas.microsoft.com/office/word/2024/wordml/sdtformatlock" xmlns:w16se="http://schemas.microsoft.com/office/word/2015/wordml/symex" mc:Ignorable="w14 w15 w16se w16cid w16 w16cex w16sdtdh w16sdtfl w16du">
   <w:docDefaults>
     <w:rPrDefault>
       <w:rPr>
@@ -17366,7 +16447,6 @@
   <w:style w:type="character" w:default="1" w:styleId="Policepardfaut">
     <w:name w:val="Default Paragraph Font"/>
     <w:uiPriority w:val="1"/>
-    <w:semiHidden/>
     <w:unhideWhenUsed/>
   </w:style>
   <w:style w:type="table" w:default="1" w:styleId="TableauNormal">
@@ -17451,6 +16531,25 @@
       <w:ind w:left="105" w:right="52"/>
       <w:jc w:val="center"/>
     </w:pPr>
+  </w:style>
+  <w:style w:type="paragraph" w:styleId="NormalWeb">
+    <w:name w:val="Normal (Web)"/>
+    <w:basedOn w:val="Normal"/>
+    <w:uiPriority w:val="99"/>
+    <w:semiHidden/>
+    <w:unhideWhenUsed/>
+    <w:rsid w:val="0034665A"/>
+    <w:pPr>
+      <w:widowControl/>
+      <w:autoSpaceDE/>
+      <w:autoSpaceDN/>
+      <w:spacing w:before="100" w:beforeAutospacing="1" w:after="100" w:afterAutospacing="1"/>
+    </w:pPr>
+    <w:rPr>
+      <w:sz w:val="24"/>
+      <w:szCs w:val="24"/>
+      <w:lang w:eastAsia="fr-FR"/>
+    </w:rPr>
   </w:style>
 </w:styles>
 </file>

</xml_diff>